<commit_message>
docs: alinha a especificação e os READMEs à correção do pedido
No pedido só o cliente (na criação) e os itens são informados; dados do
cliente, observação e pagamento são somente leitura. Contagem de testes
atualizada para 66 por versão (.md e .docx).

Co-Authored-By: Claude Opus 5.5 <noreply@anthropic.com>
</commit_message>
<xml_diff>
--- a/docs/especificacao-tecnica.docx
+++ b/docs/especificacao-tecnica.docx
@@ -1079,31 +1079,28 @@
                 <w:b w:val="0"/>
                 <w:sz w:val="16"/>
               </w:rPr>
-              <w:t>node:test</w:t>
-            </w:r>
-            <w:r>
-              <w:rPr>
-                <w:rFonts w:ascii="72" w:hAnsi="72" w:cs="72" w:eastAsia="72"/>
-                <w:b w:val="0"/>
-                <w:sz w:val="18"/>
-              </w:rPr>
-              <w:t xml:space="preserve"> + </w:t>
-            </w:r>
-            <w:r>
-              <w:rPr>
-                <w:rFonts w:ascii="Consolas" w:hAnsi="Consolas" w:cs="Consolas" w:eastAsia="Consolas"/>
-                <w:b w:val="0"/>
-                <w:sz w:val="16"/>
-              </w:rPr>
-              <w:t>@cap-js/cds-test</w:t>
-            </w:r>
-            <w:r>
-              <w:rPr>
-                <w:rFonts w:ascii="72" w:hAnsi="72" w:cs="72" w:eastAsia="72"/>
-                <w:b w:val="0"/>
-                <w:sz w:val="18"/>
-              </w:rPr>
-              <w:t xml:space="preserve"> (63 testes por versão), ESLint 10</w:t>
+              <w:t>node:test + @cap-js/cds-test (66 testes por versão), ESLint 10</w:t>
+            </w:r>
+            <w:r>
+              <w:rPr>
+                <w:rFonts w:ascii="72" w:hAnsi="72" w:cs="72" w:eastAsia="72"/>
+                <w:b w:val="0"/>
+                <w:sz w:val="18"/>
+              </w:rPr>
+            </w:r>
+            <w:r>
+              <w:rPr>
+                <w:rFonts w:ascii="Consolas" w:hAnsi="Consolas" w:cs="Consolas" w:eastAsia="Consolas"/>
+                <w:b w:val="0"/>
+                <w:sz w:val="16"/>
+              </w:rPr>
+            </w:r>
+            <w:r>
+              <w:rPr>
+                <w:rFonts w:ascii="72" w:hAnsi="72" w:cs="72" w:eastAsia="72"/>
+                <w:b w:val="0"/>
+                <w:sz w:val="18"/>
+              </w:rPr>
             </w:r>
           </w:p>
         </w:tc>
@@ -8332,7 +8329,7 @@
                 <w:b w:val="0"/>
                 <w:sz w:val="18"/>
               </w:rPr>
-              <w:t>Livre</w:t>
+              <w:t>Somente leitura na tela; preenchida na importação por planilha</w:t>
             </w:r>
           </w:p>
         </w:tc>
@@ -15505,7 +15502,7 @@
                 <w:b w:val="0"/>
                 <w:sz w:val="18"/>
               </w:rPr>
-              <w:t>Sim (itens e observação)</w:t>
+              <w:t>Sim (somente itens)</w:t>
             </w:r>
           </w:p>
         </w:tc>
@@ -17167,7 +17164,7 @@
           <w:b w:val="0"/>
           <w:sz w:val="20"/>
         </w:rPr>
-        <w:t>Só os itens e a observação mudam; o cliente é imutável (</w:t>
+        <w:t>Só os itens mudam; o cliente é imutável (PEDIDO_CLIENTE_IMUTAVEL).</w:t>
       </w:r>
       <w:r>
         <w:rPr>
@@ -17175,7 +17172,6 @@
           <w:b w:val="0"/>
           <w:sz w:val="18"/>
         </w:rPr>
-        <w:t>PEDIDO_CLIENTE_IMUTAVEL</w:t>
       </w:r>
       <w:r>
         <w:rPr>
@@ -17183,7 +17179,6 @@
           <w:b w:val="0"/>
           <w:sz w:val="20"/>
         </w:rPr>
-        <w:t>).</w:t>
       </w:r>
     </w:p>
     <w:p>
@@ -21491,6 +21486,32 @@
         <w:rPr>
           <w:rFonts w:ascii="72" w:hAnsi="72" w:cs="72" w:eastAsia="72"/>
           <w:b w:val="0"/>
+          <w:sz w:val="20"/>
+        </w:rPr>
+        <w:t>O usuário informa apenas o Cliente (só na criação) e os itens. CPF, e-mail, telefone, gênero, nascimento e endereço de entrega são preenchidos automaticamente pela associação cliente e são somente leitura (@Core.Computed); os demais campos do pedido são mantidos pelo backend.</w:t>
+      </w:r>
+    </w:p>
+    <w:p>
+      <w:pPr>
+        <w:pStyle w:val="Commarcadores"/>
+      </w:pPr>
+      <w:r>
+        <w:rPr>
+          <w:rFonts w:ascii="72" w:hAnsi="72" w:cs="72" w:eastAsia="72"/>
+          <w:b w:val="0"/>
+          <w:sz w:val="20"/>
+        </w:rPr>
+        <w:t>A seção Pagamento é somente leitura (Pagamentos é @readonly no PedidosService): só a ação Efetuar Pagamento grava o pagamento, e a edição dos itens não o altera.</w:t>
+      </w:r>
+    </w:p>
+    <w:p>
+      <w:pPr>
+        <w:pStyle w:val="Commarcadores"/>
+      </w:pPr>
+      <w:r>
+        <w:rPr>
+          <w:rFonts w:ascii="72" w:hAnsi="72" w:cs="72" w:eastAsia="72"/>
+          <w:b w:val="0"/>
           <w:i/>
           <w:sz w:val="20"/>
         </w:rPr>
@@ -25990,7 +26011,7 @@
           <w:b w:val="0"/>
           <w:sz w:val="20"/>
         </w:rPr>
-        <w:t>63 testes por versão (</w:t>
+        <w:t>66 testes por versão (node:test + @cap-js/cds-test), com um servidor ViaCEP falso local (sem rede externa) e um gerador de .xlsx mínimo. São permanentes, como a suíte ABAP Unit do RAP.</w:t>
       </w:r>
       <w:r>
         <w:rPr>
@@ -25998,7 +26019,6 @@
           <w:b w:val="0"/>
           <w:sz w:val="18"/>
         </w:rPr>
-        <w:t>node:test</w:t>
       </w:r>
       <w:r>
         <w:rPr>
@@ -26006,7 +26026,6 @@
           <w:b w:val="0"/>
           <w:sz w:val="20"/>
         </w:rPr>
-        <w:t xml:space="preserve"> + </w:t>
       </w:r>
       <w:r>
         <w:rPr>
@@ -26014,7 +26033,6 @@
           <w:b w:val="0"/>
           <w:sz w:val="18"/>
         </w:rPr>
-        <w:t>@cap-js/cds-test</w:t>
       </w:r>
       <w:r>
         <w:rPr>
@@ -26022,7 +26040,6 @@
           <w:b w:val="0"/>
           <w:sz w:val="20"/>
         </w:rPr>
-        <w:t xml:space="preserve">), com um servidor ViaCEP falso local (sem rede externa) e um gerador de </w:t>
       </w:r>
       <w:r>
         <w:rPr>
@@ -26030,7 +26047,6 @@
           <w:b w:val="0"/>
           <w:sz w:val="18"/>
         </w:rPr>
-        <w:t>.xlsx</w:t>
       </w:r>
       <w:r>
         <w:rPr>
@@ -26038,7 +26054,6 @@
           <w:b w:val="0"/>
           <w:sz w:val="20"/>
         </w:rPr>
-        <w:t xml:space="preserve"> mínimo. São permanentes, como a suíte ABAP Unit do RAP.</w:t>
       </w:r>
     </w:p>
     <w:tbl>
@@ -26341,7 +26356,7 @@
                 <w:b w:val="0"/>
                 <w:sz w:val="18"/>
               </w:rPr>
-              <w:t>Registro com reserva, edição pela diferença, pagamento, aprovação, cancelamento, reembolso</w:t>
+              <w:t>Registro com reserva, edição pela diferença, pagamento, aprovação, cancelamento, reembolso, campos somente leitura (cliente e pagamento)</w:t>
             </w:r>
           </w:p>
         </w:tc>
@@ -28968,7 +28983,7 @@
                 <w:b w:val="0"/>
                 <w:sz w:val="18"/>
               </w:rPr>
-              <w:t>63 testes automatizados por versão</w:t>
+              <w:t>66 testes automatizados por versão</w:t>
             </w:r>
           </w:p>
         </w:tc>

</xml_diff>

<commit_message>
feat(pedidos): importação de pedidos sem duplicidade
A coluna Pedido da planilha passa a ser gravada como referenciaImportacao
(somente leitura, até 40 caracteres) e funciona como chave de
idempotência: a mesma referência para o mesmo cliente é recusada enquanto
houver pedido não cancelado com ela. Reenviar a mesma planilha não cria
pedidos repetidos. Testes de regressão nas duas versões (68 por versão).

Co-Authored-By: Claude Opus 5.5 <noreply@anthropic.com>
</commit_message>
<xml_diff>
--- a/docs/especificacao-tecnica.docx
+++ b/docs/especificacao-tecnica.docx
@@ -1079,7 +1079,7 @@
                 <w:b w:val="0"/>
                 <w:sz w:val="16"/>
               </w:rPr>
-              <w:t>node:test + @cap-js/cds-test (66 testes por versão), ESLint 10</w:t>
+              <w:t>node:test + @cap-js/cds-test (68 testes por versão), ESLint 10</w:t>
             </w:r>
             <w:r>
               <w:rPr>
@@ -8330,6 +8330,53 @@
                 <w:sz w:val="18"/>
               </w:rPr>
               <w:t>Somente leitura na tela; preenchida na importação por planilha</w:t>
+            </w:r>
+          </w:p>
+        </w:tc>
+      </w:tr>
+      <w:tr>
+        <w:tc>
+          <w:tcPr>
+            <w:tcW w:type="dxa" w:w="3360"/>
+          </w:tcPr>
+          <w:p>
+            <w:r>
+              <w:rPr>
+                <w:rFonts w:ascii="Consolas" w:hAnsi="Consolas" w:cs="Consolas" w:eastAsia="Consolas"/>
+                <w:b w:val="0"/>
+                <w:sz w:val="16"/>
+              </w:rPr>
+              <w:t>referenciaImportacao</w:t>
+            </w:r>
+          </w:p>
+        </w:tc>
+        <w:tc>
+          <w:tcPr>
+            <w:tcW w:type="dxa" w:w="3360"/>
+          </w:tcPr>
+          <w:p>
+            <w:r>
+              <w:rPr>
+                <w:rFonts w:ascii="Consolas" w:hAnsi="Consolas" w:cs="Consolas" w:eastAsia="Consolas"/>
+                <w:b w:val="0"/>
+                <w:sz w:val="16"/>
+              </w:rPr>
+              <w:t>String(40)</w:t>
+            </w:r>
+          </w:p>
+        </w:tc>
+        <w:tc>
+          <w:tcPr>
+            <w:tcW w:type="dxa" w:w="3360"/>
+          </w:tcPr>
+          <w:p>
+            <w:r>
+              <w:rPr>
+                <w:rFonts w:ascii="72" w:hAnsi="72" w:cs="72" w:eastAsia="72"/>
+                <w:b w:val="0"/>
+                <w:sz w:val="18"/>
+              </w:rPr>
+              <w:t>Referência da planilha (coluna Pedido), gravada só pela importação; somente leitura</w:t>
             </w:r>
           </w:p>
         </w:tc>
@@ -19692,23 +19739,21 @@
                 <w:b w:val="0"/>
                 <w:sz w:val="18"/>
               </w:rPr>
-              <w:t xml:space="preserve">Linhas com a mesma referência formam um pedido; cliente ativo com endereço principal; itens ativos; o disponível precisa cobrir a soma da planilha inteira; cada pedido nasce </w:t>
-            </w:r>
-            <w:r>
-              <w:rPr>
-                <w:rFonts w:ascii="Consolas" w:hAnsi="Consolas" w:cs="Consolas" w:eastAsia="Consolas"/>
-                <w:b w:val="0"/>
-                <w:sz w:val="16"/>
-              </w:rPr>
-              <w:t>ABERTO</w:t>
-            </w:r>
-            <w:r>
-              <w:rPr>
-                <w:rFonts w:ascii="72" w:hAnsi="72" w:cs="72" w:eastAsia="72"/>
-                <w:b w:val="0"/>
-                <w:sz w:val="18"/>
-              </w:rPr>
-              <w:t xml:space="preserve"> com reserva</w:t>
+              <w:t>Linhas com a mesma referência formam um pedido; cliente ativo com endereço principal; itens ativos; o disponível precisa cobrir a soma da planilha inteira; cada pedido nasce ABERTO com reserva; a referência é gravada no pedido e a mesma referência para o mesmo cliente é recusada enquanto houver pedido não cancelado com ela (reenviar a planilha não duplica pedidos); referência com até 40 caracteres</w:t>
+            </w:r>
+            <w:r>
+              <w:rPr>
+                <w:rFonts w:ascii="Consolas" w:hAnsi="Consolas" w:cs="Consolas" w:eastAsia="Consolas"/>
+                <w:b w:val="0"/>
+                <w:sz w:val="16"/>
+              </w:rPr>
+            </w:r>
+            <w:r>
+              <w:rPr>
+                <w:rFonts w:ascii="72" w:hAnsi="72" w:cs="72" w:eastAsia="72"/>
+                <w:b w:val="0"/>
+                <w:sz w:val="18"/>
+              </w:rPr>
             </w:r>
           </w:p>
         </w:tc>
@@ -26011,7 +26056,7 @@
           <w:b w:val="0"/>
           <w:sz w:val="20"/>
         </w:rPr>
-        <w:t>66 testes por versão (node:test + @cap-js/cds-test), com um servidor ViaCEP falso local (sem rede externa) e um gerador de .xlsx mínimo. São permanentes, como a suíte ABAP Unit do RAP.</w:t>
+        <w:t>68 testes por versão (node:test + @cap-js/cds-test), com um servidor ViaCEP falso local (sem rede externa) e um gerador de .xlsx mínimo. São permanentes, como a suíte ABAP Unit do RAP.</w:t>
       </w:r>
       <w:r>
         <w:rPr>
@@ -26482,15 +26527,14 @@
                 <w:b w:val="0"/>
                 <w:sz w:val="18"/>
               </w:rPr>
-              <w:t xml:space="preserve">Clientes, estoque e pedidos (tudo ou nada) e modelos de </w:t>
-            </w:r>
-            <w:r>
-              <w:rPr>
-                <w:rFonts w:ascii="Consolas" w:hAnsi="Consolas" w:cs="Consolas" w:eastAsia="Consolas"/>
-                <w:b w:val="0"/>
-                <w:sz w:val="16"/>
-              </w:rPr>
-              <w:t>docs/</w:t>
+              <w:t>Clientes, estoque e pedidos (tudo ou nada), reimportação de pedidos recusada e modelos de docs/</w:t>
+            </w:r>
+            <w:r>
+              <w:rPr>
+                <w:rFonts w:ascii="Consolas" w:hAnsi="Consolas" w:cs="Consolas" w:eastAsia="Consolas"/>
+                <w:b w:val="0"/>
+                <w:sz w:val="16"/>
+              </w:rPr>
             </w:r>
           </w:p>
         </w:tc>
@@ -28983,7 +29027,7 @@
                 <w:b w:val="0"/>
                 <w:sz w:val="18"/>
               </w:rPr>
-              <w:t>66 testes automatizados por versão</w:t>
+              <w:t>68 testes automatizados por versão</w:t>
             </w:r>
           </w:p>
         </w:tc>

</xml_diff>

<commit_message>
docs: navegação entre aplicações e especificação técnica 2.1
READMEs e especificação (.md e .docx) passam a refletir a navegação entre
as apps (Pedido -> Cliente/Item, Reembolso -> Pedido/Cliente), os campos
skuItem e cpfCliente usados no contexto da navegação, a importação de
pedidos sem duplicidade e o histórico de versões (v1.3 e v1.4).

Co-Authored-By: Claude Opus 5.5 <noreply@anthropic.com>
</commit_message>
<xml_diff>
--- a/docs/especificacao-tecnica.docx
+++ b/docs/especificacao-tecnica.docx
@@ -12,7 +12,7 @@
           <w:b/>
           <w:sz w:val="20"/>
         </w:rPr>
-        <w:t>Versão 2.0 — outubro de 2026.</w:t>
+        <w:t>Versão 2.1 — outubro de 2026. Esta revisão descreve o sistema como implementado nas duas versões do repositório: nodejs-padrao (JavaScript) e nodejs-typescript (TypeScript). As duas compartilham o mesmo modelo CDS, os mesmos serviços, as mesmas aplicações SAPUI5 e a mesma suíte de testes; diferem apenas na linguagem dos handlers (seção 19). A seção 22 resume o que mudou em relação à versão 1 e na revisão 2.1 (campos somente leitura no pedido, navegação entre apps e importação de pedidos sem duplicidade).</w:t>
       </w:r>
       <w:r>
         <w:rPr>
@@ -20,7 +20,6 @@
           <w:b w:val="0"/>
           <w:sz w:val="20"/>
         </w:rPr>
-        <w:t xml:space="preserve"> Esta revisão descreve o sistema </w:t>
       </w:r>
       <w:r>
         <w:rPr>
@@ -28,7 +27,6 @@
           <w:b/>
           <w:sz w:val="20"/>
         </w:rPr>
-        <w:t>como implementado</w:t>
       </w:r>
       <w:r>
         <w:rPr>
@@ -36,7 +34,6 @@
           <w:b w:val="0"/>
           <w:sz w:val="20"/>
         </w:rPr>
-        <w:t xml:space="preserve"> nas duas versões do repositório: </w:t>
       </w:r>
       <w:r>
         <w:rPr>
@@ -44,7 +41,6 @@
           <w:b w:val="0"/>
           <w:sz w:val="18"/>
         </w:rPr>
-        <w:t>nodejs-padrao</w:t>
       </w:r>
       <w:r>
         <w:rPr>
@@ -52,7 +48,6 @@
           <w:b w:val="0"/>
           <w:sz w:val="20"/>
         </w:rPr>
-        <w:t xml:space="preserve"> (JavaScript) e </w:t>
       </w:r>
       <w:r>
         <w:rPr>
@@ -60,7 +55,6 @@
           <w:b w:val="0"/>
           <w:sz w:val="18"/>
         </w:rPr>
-        <w:t>nodejs-typescript</w:t>
       </w:r>
       <w:r>
         <w:rPr>
@@ -68,7 +62,6 @@
           <w:b w:val="0"/>
           <w:sz w:val="20"/>
         </w:rPr>
-        <w:t xml:space="preserve"> (TypeScript). As duas compartilham o mesmo modelo CDS, os mesmos serviços, as mesmas aplicações SAPUI5 e a mesma suíte de testes; diferem apenas na linguagem dos handlers (seção 19). A seção 22 resume o que mudou em relação à versão 1.</w:t>
       </w:r>
     </w:p>
     <w:p>
@@ -12598,95 +12591,84 @@
                 <w:b w:val="0"/>
                 <w:sz w:val="16"/>
               </w:rPr>
-              <w:t>Pedidos</w:t>
-            </w:r>
-            <w:r>
-              <w:rPr>
-                <w:rFonts w:ascii="72" w:hAnsi="72" w:cs="72" w:eastAsia="72"/>
-                <w:b w:val="0"/>
-                <w:sz w:val="18"/>
-              </w:rPr>
-              <w:t xml:space="preserve"> (com dados do cliente), </w:t>
-            </w:r>
-            <w:r>
-              <w:rPr>
-                <w:rFonts w:ascii="Consolas" w:hAnsi="Consolas" w:cs="Consolas" w:eastAsia="Consolas"/>
-                <w:b w:val="0"/>
-                <w:sz w:val="16"/>
-              </w:rPr>
-              <w:t>Clientes</w:t>
-            </w:r>
-            <w:r>
-              <w:rPr>
-                <w:rFonts w:ascii="72" w:hAnsi="72" w:cs="72" w:eastAsia="72"/>
-                <w:b w:val="0"/>
-                <w:sz w:val="18"/>
-              </w:rPr>
-              <w:t xml:space="preserve">, </w:t>
-            </w:r>
-            <w:r>
-              <w:rPr>
-                <w:rFonts w:ascii="Consolas" w:hAnsi="Consolas" w:cs="Consolas" w:eastAsia="Consolas"/>
-                <w:b w:val="0"/>
-                <w:sz w:val="16"/>
-              </w:rPr>
-              <w:t>ClientesAtivos</w:t>
-            </w:r>
-            <w:r>
-              <w:rPr>
-                <w:rFonts w:ascii="72" w:hAnsi="72" w:cs="72" w:eastAsia="72"/>
-                <w:b w:val="0"/>
-                <w:sz w:val="18"/>
-              </w:rPr>
-              <w:t xml:space="preserve">, </w:t>
-            </w:r>
-            <w:r>
-              <w:rPr>
-                <w:rFonts w:ascii="Consolas" w:hAnsi="Consolas" w:cs="Consolas" w:eastAsia="Consolas"/>
-                <w:b w:val="0"/>
-                <w:sz w:val="16"/>
-              </w:rPr>
-              <w:t>Enderecos</w:t>
-            </w:r>
-            <w:r>
-              <w:rPr>
-                <w:rFonts w:ascii="72" w:hAnsi="72" w:cs="72" w:eastAsia="72"/>
-                <w:b w:val="0"/>
-                <w:sz w:val="18"/>
-              </w:rPr>
-              <w:t xml:space="preserve">, </w:t>
-            </w:r>
-            <w:r>
-              <w:rPr>
-                <w:rFonts w:ascii="Consolas" w:hAnsi="Consolas" w:cs="Consolas" w:eastAsia="Consolas"/>
-                <w:b w:val="0"/>
-                <w:sz w:val="16"/>
-              </w:rPr>
-              <w:t>Itens</w:t>
-            </w:r>
-            <w:r>
-              <w:rPr>
-                <w:rFonts w:ascii="72" w:hAnsi="72" w:cs="72" w:eastAsia="72"/>
-                <w:b w:val="0"/>
-                <w:sz w:val="18"/>
-              </w:rPr>
-              <w:t xml:space="preserve">, </w:t>
-            </w:r>
-            <w:r>
-              <w:rPr>
-                <w:rFonts w:ascii="Consolas" w:hAnsi="Consolas" w:cs="Consolas" w:eastAsia="Consolas"/>
-                <w:b w:val="0"/>
-                <w:sz w:val="16"/>
-              </w:rPr>
-              <w:t>ItensAtivos</w:t>
-            </w:r>
-            <w:r>
-              <w:rPr>
-                <w:rFonts w:ascii="72" w:hAnsi="72" w:cs="72" w:eastAsia="72"/>
-                <w:b w:val="0"/>
-                <w:sz w:val="18"/>
-              </w:rPr>
-              <w:t>, CodeLists</w:t>
+              <w:t>Pedidos (com dados do cliente), ItensPedido (com skuItem, o SKU do item), Clientes, ClientesAtivos, Enderecos, Itens, ItensAtivos, CodeLists</w:t>
+            </w:r>
+            <w:r>
+              <w:rPr>
+                <w:rFonts w:ascii="72" w:hAnsi="72" w:cs="72" w:eastAsia="72"/>
+                <w:b w:val="0"/>
+                <w:sz w:val="18"/>
+              </w:rPr>
+            </w:r>
+            <w:r>
+              <w:rPr>
+                <w:rFonts w:ascii="Consolas" w:hAnsi="Consolas" w:cs="Consolas" w:eastAsia="Consolas"/>
+                <w:b w:val="0"/>
+                <w:sz w:val="16"/>
+              </w:rPr>
+            </w:r>
+            <w:r>
+              <w:rPr>
+                <w:rFonts w:ascii="72" w:hAnsi="72" w:cs="72" w:eastAsia="72"/>
+                <w:b w:val="0"/>
+                <w:sz w:val="18"/>
+              </w:rPr>
+            </w:r>
+            <w:r>
+              <w:rPr>
+                <w:rFonts w:ascii="Consolas" w:hAnsi="Consolas" w:cs="Consolas" w:eastAsia="Consolas"/>
+                <w:b w:val="0"/>
+                <w:sz w:val="16"/>
+              </w:rPr>
+            </w:r>
+            <w:r>
+              <w:rPr>
+                <w:rFonts w:ascii="72" w:hAnsi="72" w:cs="72" w:eastAsia="72"/>
+                <w:b w:val="0"/>
+                <w:sz w:val="18"/>
+              </w:rPr>
+            </w:r>
+            <w:r>
+              <w:rPr>
+                <w:rFonts w:ascii="Consolas" w:hAnsi="Consolas" w:cs="Consolas" w:eastAsia="Consolas"/>
+                <w:b w:val="0"/>
+                <w:sz w:val="16"/>
+              </w:rPr>
+            </w:r>
+            <w:r>
+              <w:rPr>
+                <w:rFonts w:ascii="72" w:hAnsi="72" w:cs="72" w:eastAsia="72"/>
+                <w:b w:val="0"/>
+                <w:sz w:val="18"/>
+              </w:rPr>
+            </w:r>
+            <w:r>
+              <w:rPr>
+                <w:rFonts w:ascii="Consolas" w:hAnsi="Consolas" w:cs="Consolas" w:eastAsia="Consolas"/>
+                <w:b w:val="0"/>
+                <w:sz w:val="16"/>
+              </w:rPr>
+            </w:r>
+            <w:r>
+              <w:rPr>
+                <w:rFonts w:ascii="72" w:hAnsi="72" w:cs="72" w:eastAsia="72"/>
+                <w:b w:val="0"/>
+                <w:sz w:val="18"/>
+              </w:rPr>
+            </w:r>
+            <w:r>
+              <w:rPr>
+                <w:rFonts w:ascii="Consolas" w:hAnsi="Consolas" w:cs="Consolas" w:eastAsia="Consolas"/>
+                <w:b w:val="0"/>
+                <w:sz w:val="16"/>
+              </w:rPr>
+            </w:r>
+            <w:r>
+              <w:rPr>
+                <w:rFonts w:ascii="72" w:hAnsi="72" w:cs="72" w:eastAsia="72"/>
+                <w:b w:val="0"/>
+                <w:sz w:val="18"/>
+              </w:rPr>
             </w:r>
           </w:p>
         </w:tc>
@@ -12835,39 +12817,35 @@
                 <w:b w:val="0"/>
                 <w:sz w:val="16"/>
               </w:rPr>
-              <w:t>Reembolsos</w:t>
-            </w:r>
-            <w:r>
-              <w:rPr>
-                <w:rFonts w:ascii="72" w:hAnsi="72" w:cs="72" w:eastAsia="72"/>
-                <w:b w:val="0"/>
-                <w:sz w:val="18"/>
-              </w:rPr>
-              <w:t xml:space="preserve"> (somente leitura, com dados do cliente), </w:t>
-            </w:r>
-            <w:r>
-              <w:rPr>
-                <w:rFonts w:ascii="Consolas" w:hAnsi="Consolas" w:cs="Consolas" w:eastAsia="Consolas"/>
-                <w:b w:val="0"/>
-                <w:sz w:val="16"/>
-              </w:rPr>
-              <w:t>StatusReembolso</w:t>
-            </w:r>
-            <w:r>
-              <w:rPr>
-                <w:rFonts w:ascii="72" w:hAnsi="72" w:cs="72" w:eastAsia="72"/>
-                <w:b w:val="0"/>
-                <w:sz w:val="18"/>
-              </w:rPr>
-              <w:t xml:space="preserve">, </w:t>
-            </w:r>
-            <w:r>
-              <w:rPr>
-                <w:rFonts w:ascii="Consolas" w:hAnsi="Consolas" w:cs="Consolas" w:eastAsia="Consolas"/>
-                <w:b w:val="0"/>
-                <w:sz w:val="16"/>
-              </w:rPr>
-              <w:t>StatusPedido</w:t>
+              <w:t>Reembolsos (somente leitura, com nome, cpfCliente e cpfClienteFormatado do cliente), StatusReembolso, StatusPedido</w:t>
+            </w:r>
+            <w:r>
+              <w:rPr>
+                <w:rFonts w:ascii="72" w:hAnsi="72" w:cs="72" w:eastAsia="72"/>
+                <w:b w:val="0"/>
+                <w:sz w:val="18"/>
+              </w:rPr>
+            </w:r>
+            <w:r>
+              <w:rPr>
+                <w:rFonts w:ascii="Consolas" w:hAnsi="Consolas" w:cs="Consolas" w:eastAsia="Consolas"/>
+                <w:b w:val="0"/>
+                <w:sz w:val="16"/>
+              </w:rPr>
+            </w:r>
+            <w:r>
+              <w:rPr>
+                <w:rFonts w:ascii="72" w:hAnsi="72" w:cs="72" w:eastAsia="72"/>
+                <w:b w:val="0"/>
+                <w:sz w:val="18"/>
+              </w:rPr>
+            </w:r>
+            <w:r>
+              <w:rPr>
+                <w:rFonts w:ascii="Consolas" w:hAnsi="Consolas" w:cs="Consolas" w:eastAsia="Consolas"/>
+                <w:b w:val="0"/>
+                <w:sz w:val="16"/>
+              </w:rPr>
             </w:r>
           </w:p>
         </w:tc>
@@ -21000,7 +20978,7 @@
           <w:b w:val="0"/>
           <w:sz w:val="20"/>
         </w:rPr>
-        <w:t xml:space="preserve">O launchpad tem um tile por aplicação. Os </w:t>
+        <w:t>O launchpad tem um tile por aplicação. Os intents (Cliente-manage, ItemEstoque-manage, PedidoCompra-manage, Reembolso-manage, AnaliseCompras-display) são os mesmos dos inbounds dos manifests, o que habilita a navegação entre apps (seção 15.4).</w:t>
       </w:r>
       <w:r>
         <w:rPr>
@@ -21009,7 +20987,6 @@
           <w:i/>
           <w:sz w:val="20"/>
         </w:rPr>
-        <w:t>intents</w:t>
       </w:r>
       <w:r>
         <w:rPr>
@@ -21017,7 +20994,6 @@
           <w:b w:val="0"/>
           <w:sz w:val="20"/>
         </w:rPr>
-        <w:t xml:space="preserve"> (</w:t>
       </w:r>
       <w:r>
         <w:rPr>
@@ -21025,7 +21001,6 @@
           <w:b w:val="0"/>
           <w:sz w:val="18"/>
         </w:rPr>
-        <w:t>Cliente-manage</w:t>
       </w:r>
       <w:r>
         <w:rPr>
@@ -21033,7 +21008,6 @@
           <w:b w:val="0"/>
           <w:sz w:val="20"/>
         </w:rPr>
-        <w:t xml:space="preserve">, </w:t>
       </w:r>
       <w:r>
         <w:rPr>
@@ -21041,7 +21015,6 @@
           <w:b w:val="0"/>
           <w:sz w:val="18"/>
         </w:rPr>
-        <w:t>ItemEstoque-manage</w:t>
       </w:r>
       <w:r>
         <w:rPr>
@@ -21049,7 +21022,6 @@
           <w:b w:val="0"/>
           <w:sz w:val="20"/>
         </w:rPr>
-        <w:t xml:space="preserve">, </w:t>
       </w:r>
       <w:r>
         <w:rPr>
@@ -21057,7 +21029,6 @@
           <w:b w:val="0"/>
           <w:sz w:val="18"/>
         </w:rPr>
-        <w:t>PedidoCompra-manage</w:t>
       </w:r>
       <w:r>
         <w:rPr>
@@ -21065,7 +21036,6 @@
           <w:b w:val="0"/>
           <w:sz w:val="20"/>
         </w:rPr>
-        <w:t xml:space="preserve">, </w:t>
       </w:r>
       <w:r>
         <w:rPr>
@@ -21073,7 +21043,6 @@
           <w:b w:val="0"/>
           <w:sz w:val="18"/>
         </w:rPr>
-        <w:t>Reembolso-manage</w:t>
       </w:r>
       <w:r>
         <w:rPr>
@@ -21081,7 +21050,6 @@
           <w:b w:val="0"/>
           <w:sz w:val="20"/>
         </w:rPr>
-        <w:t xml:space="preserve">, </w:t>
       </w:r>
       <w:r>
         <w:rPr>
@@ -21089,7 +21057,6 @@
           <w:b w:val="0"/>
           <w:sz w:val="18"/>
         </w:rPr>
-        <w:t>AnaliseCompras-display</w:t>
       </w:r>
       <w:r>
         <w:rPr>
@@ -21097,7 +21064,6 @@
           <w:b w:val="0"/>
           <w:sz w:val="20"/>
         </w:rPr>
-        <w:t xml:space="preserve">) são os mesmos dos </w:t>
       </w:r>
       <w:r>
         <w:rPr>
@@ -21106,7 +21072,6 @@
           <w:i/>
           <w:sz w:val="20"/>
         </w:rPr>
-        <w:t>inbounds</w:t>
       </w:r>
       <w:r>
         <w:rPr>
@@ -21114,7 +21079,6 @@
           <w:b w:val="0"/>
           <w:sz w:val="20"/>
         </w:rPr>
-        <w:t xml:space="preserve"> dos manifests, o que habilita a navegação entre apps (ex.: cliente e item do pedido abrem as apps de Clientes e Estoque).</w:t>
       </w:r>
     </w:p>
     <w:p>
@@ -21619,6 +21583,504 @@
     </w:p>
     <w:p>
       <w:pPr>
+        <w:pStyle w:val="Ttulo2"/>
+      </w:pPr>
+      <w:r>
+        <w:rPr>
+          <w:rFonts w:ascii="72" w:hAnsi="72" w:cs="72" w:eastAsia="72"/>
+          <w:b w:val="0"/>
+          <w:sz w:val="26"/>
+        </w:rPr>
+        <w:t>15.4 Navegação entre aplicações</w:t>
+      </w:r>
+    </w:p>
+    <w:p>
+      <w:pPr/>
+      <w:r>
+        <w:rPr>
+          <w:rFonts w:ascii="72" w:hAnsi="72" w:cs="72" w:eastAsia="72"/>
+          <w:b w:val="0"/>
+          <w:sz w:val="20"/>
+        </w:rPr>
+        <w:t>Os campos abaixo viram links para o registro na app de destino (no launchpad local). A app de destino abre direto a Object Page pela chave semântica (cpf do cliente, sku do item, numeroPedido do pedido), enviada no contexto da navegação.</w:t>
+      </w:r>
+      <w:r>
+        <w:rPr>
+          <w:rFonts w:ascii="72" w:hAnsi="72" w:cs="72" w:eastAsia="72"/>
+          <w:b w:val="0"/>
+          <w:i/>
+          <w:sz w:val="20"/>
+        </w:rPr>
+      </w:r>
+      <w:r>
+        <w:rPr>
+          <w:rFonts w:ascii="72" w:hAnsi="72" w:cs="72" w:eastAsia="72"/>
+          <w:b w:val="0"/>
+          <w:sz w:val="20"/>
+        </w:rPr>
+      </w:r>
+      <w:r>
+        <w:rPr>
+          <w:rFonts w:ascii="Consolas" w:hAnsi="Consolas" w:cs="Consolas" w:eastAsia="Consolas"/>
+          <w:b w:val="0"/>
+          <w:sz w:val="18"/>
+        </w:rPr>
+      </w:r>
+      <w:r>
+        <w:rPr>
+          <w:rFonts w:ascii="72" w:hAnsi="72" w:cs="72" w:eastAsia="72"/>
+          <w:b w:val="0"/>
+          <w:sz w:val="20"/>
+        </w:rPr>
+      </w:r>
+      <w:r>
+        <w:rPr>
+          <w:rFonts w:ascii="Consolas" w:hAnsi="Consolas" w:cs="Consolas" w:eastAsia="Consolas"/>
+          <w:b w:val="0"/>
+          <w:sz w:val="18"/>
+        </w:rPr>
+      </w:r>
+      <w:r>
+        <w:rPr>
+          <w:rFonts w:ascii="72" w:hAnsi="72" w:cs="72" w:eastAsia="72"/>
+          <w:b w:val="0"/>
+          <w:sz w:val="20"/>
+        </w:rPr>
+      </w:r>
+      <w:r>
+        <w:rPr>
+          <w:rFonts w:ascii="Consolas" w:hAnsi="Consolas" w:cs="Consolas" w:eastAsia="Consolas"/>
+          <w:b w:val="0"/>
+          <w:sz w:val="18"/>
+        </w:rPr>
+      </w:r>
+      <w:r>
+        <w:rPr>
+          <w:rFonts w:ascii="72" w:hAnsi="72" w:cs="72" w:eastAsia="72"/>
+          <w:b w:val="0"/>
+          <w:sz w:val="20"/>
+        </w:rPr>
+      </w:r>
+      <w:r>
+        <w:rPr>
+          <w:rFonts w:ascii="Consolas" w:hAnsi="Consolas" w:cs="Consolas" w:eastAsia="Consolas"/>
+          <w:b w:val="0"/>
+          <w:sz w:val="18"/>
+        </w:rPr>
+      </w:r>
+      <w:r>
+        <w:rPr>
+          <w:rFonts w:ascii="72" w:hAnsi="72" w:cs="72" w:eastAsia="72"/>
+          <w:b w:val="0"/>
+          <w:sz w:val="20"/>
+        </w:rPr>
+      </w:r>
+      <w:r>
+        <w:rPr>
+          <w:rFonts w:ascii="Consolas" w:hAnsi="Consolas" w:cs="Consolas" w:eastAsia="Consolas"/>
+          <w:b w:val="0"/>
+          <w:sz w:val="18"/>
+        </w:rPr>
+      </w:r>
+      <w:r>
+        <w:rPr>
+          <w:rFonts w:ascii="72" w:hAnsi="72" w:cs="72" w:eastAsia="72"/>
+          <w:b w:val="0"/>
+          <w:sz w:val="20"/>
+        </w:rPr>
+      </w:r>
+      <w:r>
+        <w:rPr>
+          <w:rFonts w:ascii="72" w:hAnsi="72" w:cs="72" w:eastAsia="72"/>
+          <w:b w:val="0"/>
+          <w:i/>
+          <w:sz w:val="20"/>
+        </w:rPr>
+      </w:r>
+      <w:r>
+        <w:rPr>
+          <w:rFonts w:ascii="72" w:hAnsi="72" w:cs="72" w:eastAsia="72"/>
+          <w:b w:val="0"/>
+          <w:sz w:val="20"/>
+        </w:rPr>
+      </w:r>
+    </w:p>
+    <w:tbl>
+      <w:tblPr>
+        <w:tblStyle w:val="Tabelacomgrade"/>
+        <w:tblW w:type="auto" w:w="0"/>
+        <w:jc w:val="center"/>
+        <w:tblLook w:firstColumn="1" w:firstRow="1" w:lastColumn="0" w:lastRow="0" w:noHBand="0" w:noVBand="1" w:val="04A0"/>
+      </w:tblPr>
+      <w:tblGrid>
+        <w:gridCol w:w="2520"/>
+        <w:gridCol w:w="2520"/>
+        <w:gridCol w:w="2520"/>
+        <w:gridCol w:w="2520"/>
+      </w:tblGrid>
+      <w:tr>
+        <w:trPr>
+          <w:tblHeader w:val="true"/>
+        </w:trPr>
+        <w:tc>
+          <w:tcPr>
+            <w:tcW w:type="dxa" w:w="2520"/>
+            <w:shd w:val="clear" w:color="auto" w:fill="0070F2"/>
+          </w:tcPr>
+          <w:p>
+            <w:r>
+              <w:rPr>
+                <w:rFonts w:ascii="72" w:hAnsi="72" w:cs="72" w:eastAsia="72"/>
+                <w:b/>
+                <w:color w:val="FFFFFF"/>
+                <w:sz w:val="20"/>
+              </w:rPr>
+              <w:t>Origem</w:t>
+            </w:r>
+          </w:p>
+        </w:tc>
+        <w:tc>
+          <w:tcPr>
+            <w:tcW w:type="dxa" w:w="2520"/>
+            <w:shd w:val="clear" w:color="auto" w:fill="0070F2"/>
+          </w:tcPr>
+          <w:p>
+            <w:r>
+              <w:rPr>
+                <w:rFonts w:ascii="72" w:hAnsi="72" w:cs="72" w:eastAsia="72"/>
+                <w:b/>
+                <w:color w:val="FFFFFF"/>
+                <w:sz w:val="20"/>
+              </w:rPr>
+              <w:t>Campos com link</w:t>
+            </w:r>
+          </w:p>
+        </w:tc>
+        <w:tc>
+          <w:tcPr>
+            <w:tcW w:type="dxa" w:w="2520"/>
+            <w:shd w:val="clear" w:color="auto" w:fill="0070F2"/>
+          </w:tcPr>
+          <w:p>
+            <w:r>
+              <w:rPr>
+                <w:rFonts w:ascii="72" w:hAnsi="72" w:cs="72" w:eastAsia="72"/>
+                <w:b/>
+                <w:color w:val="FFFFFF"/>
+                <w:sz w:val="20"/>
+              </w:rPr>
+              <w:t>Destino (intent)</w:t>
+            </w:r>
+          </w:p>
+        </w:tc>
+        <w:tc>
+          <w:tcPr>
+            <w:tcW w:type="dxa" w:w="2520"/>
+            <w:shd w:val="clear" w:color="auto" w:fill="0070F2"/>
+          </w:tcPr>
+          <w:p>
+            <w:r>
+              <w:rPr>
+                <w:rFonts w:ascii="72" w:hAnsi="72" w:cs="72" w:eastAsia="72"/>
+                <w:b/>
+                <w:color w:val="FFFFFF"/>
+                <w:sz w:val="20"/>
+              </w:rPr>
+              <w:t>Parâmetro</w:t>
+            </w:r>
+          </w:p>
+        </w:tc>
+      </w:tr>
+      <w:tr>
+        <w:tc>
+          <w:tcPr>
+            <w:tcW w:type="dxa" w:w="2520"/>
+          </w:tcPr>
+          <w:p>
+            <w:r>
+              <w:rPr>
+                <w:rFonts w:ascii="72" w:hAnsi="72" w:cs="72" w:eastAsia="72"/>
+                <w:b w:val="0"/>
+                <w:sz w:val="18"/>
+              </w:rPr>
+              <w:t>Pedidos (lista e Object Page)</w:t>
+            </w:r>
+          </w:p>
+        </w:tc>
+        <w:tc>
+          <w:tcPr>
+            <w:tcW w:type="dxa" w:w="2520"/>
+          </w:tcPr>
+          <w:p>
+            <w:r>
+              <w:rPr>
+                <w:rFonts w:ascii="72" w:hAnsi="72" w:cs="72" w:eastAsia="72"/>
+                <w:b w:val="0"/>
+                <w:sz w:val="18"/>
+              </w:rPr>
+              <w:t>Cliente, CPF</w:t>
+            </w:r>
+          </w:p>
+        </w:tc>
+        <w:tc>
+          <w:tcPr>
+            <w:tcW w:type="dxa" w:w="2520"/>
+          </w:tcPr>
+          <w:p>
+            <w:r>
+              <w:rPr>
+                <w:rFonts w:ascii="Consolas" w:hAnsi="Consolas" w:cs="Consolas" w:eastAsia="Consolas"/>
+                <w:b w:val="0"/>
+                <w:sz w:val="16"/>
+              </w:rPr>
+              <w:t>Gestão de Clientes (Cliente-manage)</w:t>
+            </w:r>
+          </w:p>
+        </w:tc>
+        <w:tc>
+          <w:tcPr>
+            <w:tcW w:type="dxa" w:w="2520"/>
+          </w:tcPr>
+          <w:p>
+            <w:r>
+              <w:rPr>
+                <w:rFonts w:ascii="Consolas" w:hAnsi="Consolas" w:cs="Consolas" w:eastAsia="Consolas"/>
+                <w:b w:val="0"/>
+                <w:sz w:val="16"/>
+              </w:rPr>
+              <w:t>cpfCliente → cpf (Common.SemanticObjectMapping)</w:t>
+            </w:r>
+          </w:p>
+        </w:tc>
+      </w:tr>
+      <w:tr>
+        <w:tc>
+          <w:tcPr>
+            <w:tcW w:type="dxa" w:w="2520"/>
+          </w:tcPr>
+          <w:p>
+            <w:r>
+              <w:rPr>
+                <w:rFonts w:ascii="72" w:hAnsi="72" w:cs="72" w:eastAsia="72"/>
+                <w:b w:val="0"/>
+                <w:sz w:val="18"/>
+              </w:rPr>
+              <w:t>Itens do pedido</w:t>
+            </w:r>
+          </w:p>
+        </w:tc>
+        <w:tc>
+          <w:tcPr>
+            <w:tcW w:type="dxa" w:w="2520"/>
+          </w:tcPr>
+          <w:p>
+            <w:r>
+              <w:rPr>
+                <w:rFonts w:ascii="72" w:hAnsi="72" w:cs="72" w:eastAsia="72"/>
+                <w:b w:val="0"/>
+                <w:sz w:val="18"/>
+              </w:rPr>
+              <w:t>Item, SKU</w:t>
+            </w:r>
+          </w:p>
+        </w:tc>
+        <w:tc>
+          <w:tcPr>
+            <w:tcW w:type="dxa" w:w="2520"/>
+          </w:tcPr>
+          <w:p>
+            <w:r>
+              <w:rPr>
+                <w:rFonts w:ascii="Consolas" w:hAnsi="Consolas" w:cs="Consolas" w:eastAsia="Consolas"/>
+                <w:b w:val="0"/>
+                <w:sz w:val="16"/>
+              </w:rPr>
+              <w:t>Gestão de Estoque (ItemEstoque-manage)</w:t>
+            </w:r>
+          </w:p>
+        </w:tc>
+        <w:tc>
+          <w:tcPr>
+            <w:tcW w:type="dxa" w:w="2520"/>
+          </w:tcPr>
+          <w:p>
+            <w:r>
+              <w:rPr>
+                <w:rFonts w:ascii="Consolas" w:hAnsi="Consolas" w:cs="Consolas" w:eastAsia="Consolas"/>
+                <w:b w:val="0"/>
+                <w:sz w:val="16"/>
+              </w:rPr>
+              <w:t>skuItem → sku</w:t>
+            </w:r>
+          </w:p>
+        </w:tc>
+      </w:tr>
+      <w:tr>
+        <w:tc>
+          <w:tcPr>
+            <w:tcW w:type="dxa" w:w="2520"/>
+          </w:tcPr>
+          <w:p>
+            <w:r>
+              <w:rPr>
+                <w:rFonts w:ascii="72" w:hAnsi="72" w:cs="72" w:eastAsia="72"/>
+                <w:b w:val="0"/>
+                <w:sz w:val="18"/>
+              </w:rPr>
+              <w:t>Reembolsos (lista e Object Page)</w:t>
+            </w:r>
+          </w:p>
+        </w:tc>
+        <w:tc>
+          <w:tcPr>
+            <w:tcW w:type="dxa" w:w="2520"/>
+          </w:tcPr>
+          <w:p>
+            <w:r>
+              <w:rPr>
+                <w:rFonts w:ascii="72" w:hAnsi="72" w:cs="72" w:eastAsia="72"/>
+                <w:b w:val="0"/>
+                <w:sz w:val="18"/>
+              </w:rPr>
+              <w:t>Pedido</w:t>
+            </w:r>
+          </w:p>
+        </w:tc>
+        <w:tc>
+          <w:tcPr>
+            <w:tcW w:type="dxa" w:w="2520"/>
+          </w:tcPr>
+          <w:p>
+            <w:r>
+              <w:rPr>
+                <w:rFonts w:ascii="Consolas" w:hAnsi="Consolas" w:cs="Consolas" w:eastAsia="Consolas"/>
+                <w:b w:val="0"/>
+                <w:sz w:val="16"/>
+              </w:rPr>
+              <w:t>Pedidos de Compras (PedidoCompra-manage)</w:t>
+            </w:r>
+          </w:p>
+        </w:tc>
+        <w:tc>
+          <w:tcPr>
+            <w:tcW w:type="dxa" w:w="2520"/>
+          </w:tcPr>
+          <w:p>
+            <w:r>
+              <w:rPr>
+                <w:rFonts w:ascii="Consolas" w:hAnsi="Consolas" w:cs="Consolas" w:eastAsia="Consolas"/>
+                <w:b w:val="0"/>
+                <w:sz w:val="16"/>
+              </w:rPr>
+              <w:t>numeroPedido</w:t>
+            </w:r>
+          </w:p>
+        </w:tc>
+      </w:tr>
+      <w:tr>
+        <w:tc>
+          <w:tcPr>
+            <w:tcW w:type="dxa" w:w="2520"/>
+          </w:tcPr>
+          <w:p>
+            <w:r>
+              <w:rPr>
+                <w:rFonts w:ascii="72" w:hAnsi="72" w:cs="72" w:eastAsia="72"/>
+                <w:b w:val="0"/>
+                <w:sz w:val="18"/>
+              </w:rPr>
+              <w:t>Reembolsos (lista e Object Page)</w:t>
+            </w:r>
+          </w:p>
+        </w:tc>
+        <w:tc>
+          <w:tcPr>
+            <w:tcW w:type="dxa" w:w="2520"/>
+          </w:tcPr>
+          <w:p>
+            <w:r>
+              <w:rPr>
+                <w:rFonts w:ascii="72" w:hAnsi="72" w:cs="72" w:eastAsia="72"/>
+                <w:b w:val="0"/>
+                <w:sz w:val="18"/>
+              </w:rPr>
+              <w:t>Cliente, CPF</w:t>
+            </w:r>
+          </w:p>
+        </w:tc>
+        <w:tc>
+          <w:tcPr>
+            <w:tcW w:type="dxa" w:w="2520"/>
+          </w:tcPr>
+          <w:p>
+            <w:r>
+              <w:rPr>
+                <w:rFonts w:ascii="Consolas" w:hAnsi="Consolas" w:cs="Consolas" w:eastAsia="Consolas"/>
+                <w:b w:val="0"/>
+                <w:sz w:val="16"/>
+              </w:rPr>
+              <w:t>Gestão de Clientes (Cliente-manage)</w:t>
+            </w:r>
+          </w:p>
+        </w:tc>
+        <w:tc>
+          <w:tcPr>
+            <w:tcW w:type="dxa" w:w="2520"/>
+          </w:tcPr>
+          <w:p>
+            <w:r>
+              <w:rPr>
+                <w:rFonts w:ascii="Consolas" w:hAnsi="Consolas" w:cs="Consolas" w:eastAsia="Consolas"/>
+                <w:b w:val="0"/>
+                <w:sz w:val="16"/>
+              </w:rPr>
+              <w:t>cpfCliente → cpf</w:t>
+            </w:r>
+          </w:p>
+        </w:tc>
+      </w:tr>
+    </w:tbl>
+    <w:p>
+      <w:pPr>
+        <w:pStyle w:val="Commarcadores"/>
+      </w:pPr>
+      <w:r>
+        <w:rPr>
+          <w:rFonts w:ascii="72" w:hAnsi="72" w:cs="72" w:eastAsia="72"/>
+          <w:b w:val="0"/>
+          <w:sz w:val="20"/>
+        </w:rPr>
+        <w:t>O Pedido do reembolso usa UI.DataFieldWithIntentBasedNavigation (link direto, sem popover): como chave semântica, numa coluna comum ele seria exibido como identificador, sem link.</w:t>
+      </w:r>
+    </w:p>
+    <w:p>
+      <w:pPr>
+        <w:pStyle w:val="Commarcadores"/>
+      </w:pPr>
+      <w:r>
+        <w:rPr>
+          <w:rFonts w:ascii="72" w:hAnsi="72" w:cs="72" w:eastAsia="72"/>
+          <w:b w:val="0"/>
+          <w:sz w:val="20"/>
+        </w:rPr>
+        <w:t>Os demais usam Common.SemanticObject + Common.SemanticObjectMapping; o CPF entra no RequestAtLeast das listas para estar sempre no contexto.</w:t>
+      </w:r>
+    </w:p>
+    <w:p>
+      <w:pPr>
+        <w:pStyle w:val="Commarcadores"/>
+      </w:pPr>
+      <w:r>
+        <w:rPr>
+          <w:rFonts w:ascii="72" w:hAnsi="72" w:cs="72" w:eastAsia="72"/>
+          <w:b w:val="0"/>
+          <w:sz w:val="20"/>
+        </w:rPr>
+        <w:t>No rascunho, os campos projetados pela associação não acompanham a troca de cliente ou item: os handlers de PATCH atualizam cpfCliente, cpfClienteFormatado e skuItem.</w:t>
+      </w:r>
+    </w:p>
+    <w:p>
+      <w:pPr>
         <w:pStyle w:val="Ttulo1"/>
       </w:pPr>
       <w:r>
@@ -24413,6 +24875,33 @@
           <w:sz w:val="20"/>
         </w:rPr>
         <w:t xml:space="preserve"> importam sem erro.</w:t>
+      </w:r>
+    </w:p>
+    <w:p>
+      <w:pPr>
+        <w:pStyle w:val="Commarcadores"/>
+      </w:pPr>
+      <w:r>
+        <w:rPr>
+          <w:rFonts w:ascii="72" w:hAnsi="72" w:cs="72" w:eastAsia="72"/>
+          <w:b w:val="0"/>
+          <w:sz w:val="20"/>
+        </w:rPr>
+        <w:t>Dado um pedido importado com a referência P001 para um cliente, quando a mesma planilha é importada de novo, então é recusada (o pedido P001 do cliente ... já foi importado) e nada é gravado; outro cliente pode usar P001, e o cancelamento do pedido libera a referência.</w:t>
+      </w:r>
+      <w:r>
+        <w:rPr>
+          <w:rFonts w:ascii="Consolas" w:hAnsi="Consolas" w:cs="Consolas" w:eastAsia="Consolas"/>
+          <w:b w:val="0"/>
+          <w:sz w:val="18"/>
+        </w:rPr>
+      </w:r>
+      <w:r>
+        <w:rPr>
+          <w:rFonts w:ascii="72" w:hAnsi="72" w:cs="72" w:eastAsia="72"/>
+          <w:b w:val="0"/>
+          <w:sz w:val="20"/>
+        </w:rPr>
       </w:r>
     </w:p>
     <w:p>
@@ -29218,6 +29707,724 @@
                 <w:sz w:val="18"/>
               </w:rPr>
               <w:t>; MTA e XSUAA pendentes</w:t>
+            </w:r>
+          </w:p>
+        </w:tc>
+      </w:tr>
+    </w:tbl>
+    <w:p>
+      <w:pPr>
+        <w:pStyle w:val="Ttulo2"/>
+      </w:pPr>
+      <w:r>
+        <w:rPr>
+          <w:rFonts w:ascii="72" w:hAnsi="72" w:cs="72" w:eastAsia="72"/>
+          <w:b w:val="0"/>
+          <w:sz w:val="26"/>
+        </w:rPr>
+        <w:t>22.3 Revisão 2.1</w:t>
+      </w:r>
+    </w:p>
+    <w:tbl>
+      <w:tblPr>
+        <w:tblStyle w:val="Tabelacomgrade"/>
+        <w:tblW w:type="auto" w:w="0"/>
+        <w:jc w:val="center"/>
+        <w:tblLook w:firstColumn="1" w:firstRow="1" w:lastColumn="0" w:lastRow="0" w:noHBand="0" w:noVBand="1" w:val="04A0"/>
+      </w:tblPr>
+      <w:tblGrid>
+        <w:gridCol w:w="3360"/>
+        <w:gridCol w:w="3360"/>
+        <w:gridCol w:w="3360"/>
+      </w:tblGrid>
+      <w:tr>
+        <w:trPr>
+          <w:tblHeader w:val="true"/>
+        </w:trPr>
+        <w:tc>
+          <w:tcPr>
+            <w:tcW w:type="dxa" w:w="3360"/>
+            <w:shd w:val="clear" w:color="auto" w:fill="0070F2"/>
+          </w:tcPr>
+          <w:p>
+            <w:r>
+              <w:rPr>
+                <w:rFonts w:ascii="72" w:hAnsi="72" w:cs="72" w:eastAsia="72"/>
+                <w:b/>
+                <w:color w:val="FFFFFF"/>
+                <w:sz w:val="20"/>
+              </w:rPr>
+              <w:t>Tema</w:t>
+            </w:r>
+          </w:p>
+        </w:tc>
+        <w:tc>
+          <w:tcPr>
+            <w:tcW w:type="dxa" w:w="3360"/>
+            <w:shd w:val="clear" w:color="auto" w:fill="0070F2"/>
+          </w:tcPr>
+          <w:p>
+            <w:r>
+              <w:rPr>
+                <w:rFonts w:ascii="72" w:hAnsi="72" w:cs="72" w:eastAsia="72"/>
+                <w:b/>
+                <w:color w:val="FFFFFF"/>
+                <w:sz w:val="20"/>
+              </w:rPr>
+              <w:t>Versão 2.0</w:t>
+            </w:r>
+          </w:p>
+        </w:tc>
+        <w:tc>
+          <w:tcPr>
+            <w:tcW w:type="dxa" w:w="3360"/>
+            <w:shd w:val="clear" w:color="auto" w:fill="0070F2"/>
+          </w:tcPr>
+          <w:p>
+            <w:r>
+              <w:rPr>
+                <w:rFonts w:ascii="72" w:hAnsi="72" w:cs="72" w:eastAsia="72"/>
+                <w:b/>
+                <w:color w:val="FFFFFF"/>
+                <w:sz w:val="20"/>
+              </w:rPr>
+              <w:t>Versão 2.1</w:t>
+            </w:r>
+          </w:p>
+        </w:tc>
+      </w:tr>
+      <w:tr>
+        <w:tc>
+          <w:tcPr>
+            <w:tcW w:type="dxa" w:w="3360"/>
+          </w:tcPr>
+          <w:p>
+            <w:r>
+              <w:rPr>
+                <w:rFonts w:ascii="72" w:hAnsi="72" w:cs="72" w:eastAsia="72"/>
+                <w:b w:val="0"/>
+                <w:sz w:val="18"/>
+              </w:rPr>
+              <w:t>Campos do pedido</w:t>
+            </w:r>
+          </w:p>
+        </w:tc>
+        <w:tc>
+          <w:tcPr>
+            <w:tcW w:type="dxa" w:w="3360"/>
+          </w:tcPr>
+          <w:p>
+            <w:r>
+              <w:rPr>
+                <w:rFonts w:ascii="Consolas" w:hAnsi="Consolas" w:cs="Consolas" w:eastAsia="Consolas"/>
+                <w:b w:val="0"/>
+                <w:sz w:val="16"/>
+              </w:rPr>
+              <w:t>Dados do cliente e pagamento apareciam editáveis</w:t>
+            </w:r>
+            <w:r>
+              <w:rPr>
+                <w:rFonts w:ascii="72" w:hAnsi="72" w:cs="72" w:eastAsia="72"/>
+                <w:b w:val="0"/>
+                <w:sz w:val="18"/>
+              </w:rPr>
+            </w:r>
+            <w:r>
+              <w:rPr>
+                <w:rFonts w:ascii="Consolas" w:hAnsi="Consolas" w:cs="Consolas" w:eastAsia="Consolas"/>
+                <w:b w:val="0"/>
+                <w:sz w:val="16"/>
+              </w:rPr>
+            </w:r>
+            <w:r>
+              <w:rPr>
+                <w:rFonts w:ascii="72" w:hAnsi="72" w:cs="72" w:eastAsia="72"/>
+                <w:b w:val="0"/>
+                <w:sz w:val="18"/>
+              </w:rPr>
+            </w:r>
+            <w:r>
+              <w:rPr>
+                <w:rFonts w:ascii="Consolas" w:hAnsi="Consolas" w:cs="Consolas" w:eastAsia="Consolas"/>
+                <w:b w:val="0"/>
+                <w:sz w:val="16"/>
+              </w:rPr>
+            </w:r>
+            <w:r>
+              <w:rPr>
+                <w:rFonts w:ascii="72" w:hAnsi="72" w:cs="72" w:eastAsia="72"/>
+                <w:b w:val="0"/>
+                <w:sz w:val="18"/>
+              </w:rPr>
+            </w:r>
+            <w:r>
+              <w:rPr>
+                <w:rFonts w:ascii="Consolas" w:hAnsi="Consolas" w:cs="Consolas" w:eastAsia="Consolas"/>
+                <w:b w:val="0"/>
+                <w:sz w:val="16"/>
+              </w:rPr>
+            </w:r>
+            <w:r>
+              <w:rPr>
+                <w:rFonts w:ascii="72" w:hAnsi="72" w:cs="72" w:eastAsia="72"/>
+                <w:b w:val="0"/>
+                <w:sz w:val="18"/>
+              </w:rPr>
+            </w:r>
+            <w:r>
+              <w:rPr>
+                <w:rFonts w:ascii="Consolas" w:hAnsi="Consolas" w:cs="Consolas" w:eastAsia="Consolas"/>
+                <w:b w:val="0"/>
+                <w:sz w:val="16"/>
+              </w:rPr>
+            </w:r>
+          </w:p>
+        </w:tc>
+        <w:tc>
+          <w:tcPr>
+            <w:tcW w:type="dxa" w:w="3360"/>
+          </w:tcPr>
+          <w:p>
+            <w:r>
+              <w:rPr>
+                <w:rFonts w:ascii="Consolas" w:hAnsi="Consolas" w:cs="Consolas" w:eastAsia="Consolas"/>
+                <w:b w:val="0"/>
+                <w:sz w:val="16"/>
+              </w:rPr>
+              <w:t>Só o Cliente (na criação) e os itens são informados; dados do cliente vêm da associação; pagamento e snapshots somente leitura; observação somente leitura na tela</w:t>
+            </w:r>
+            <w:r>
+              <w:rPr>
+                <w:rFonts w:ascii="72" w:hAnsi="72" w:cs="72" w:eastAsia="72"/>
+                <w:b w:val="0"/>
+                <w:sz w:val="18"/>
+              </w:rPr>
+            </w:r>
+            <w:r>
+              <w:rPr>
+                <w:rFonts w:ascii="Consolas" w:hAnsi="Consolas" w:cs="Consolas" w:eastAsia="Consolas"/>
+                <w:b w:val="0"/>
+                <w:sz w:val="16"/>
+              </w:rPr>
+            </w:r>
+            <w:r>
+              <w:rPr>
+                <w:rFonts w:ascii="72" w:hAnsi="72" w:cs="72" w:eastAsia="72"/>
+                <w:b w:val="0"/>
+                <w:sz w:val="18"/>
+              </w:rPr>
+            </w:r>
+            <w:r>
+              <w:rPr>
+                <w:rFonts w:ascii="Consolas" w:hAnsi="Consolas" w:cs="Consolas" w:eastAsia="Consolas"/>
+                <w:b w:val="0"/>
+                <w:sz w:val="16"/>
+              </w:rPr>
+            </w:r>
+            <w:r>
+              <w:rPr>
+                <w:rFonts w:ascii="72" w:hAnsi="72" w:cs="72" w:eastAsia="72"/>
+                <w:b w:val="0"/>
+                <w:sz w:val="18"/>
+              </w:rPr>
+            </w:r>
+            <w:r>
+              <w:rPr>
+                <w:rFonts w:ascii="Consolas" w:hAnsi="Consolas" w:cs="Consolas" w:eastAsia="Consolas"/>
+                <w:b w:val="0"/>
+                <w:sz w:val="16"/>
+              </w:rPr>
+            </w:r>
+            <w:r>
+              <w:rPr>
+                <w:rFonts w:ascii="72" w:hAnsi="72" w:cs="72" w:eastAsia="72"/>
+                <w:b w:val="0"/>
+                <w:sz w:val="18"/>
+              </w:rPr>
+            </w:r>
+            <w:r>
+              <w:rPr>
+                <w:rFonts w:ascii="Consolas" w:hAnsi="Consolas" w:cs="Consolas" w:eastAsia="Consolas"/>
+                <w:b w:val="0"/>
+                <w:sz w:val="16"/>
+              </w:rPr>
+            </w:r>
+          </w:p>
+        </w:tc>
+      </w:tr>
+      <w:tr>
+        <w:tc>
+          <w:tcPr>
+            <w:tcW w:type="dxa" w:w="3360"/>
+          </w:tcPr>
+          <w:p>
+            <w:r>
+              <w:rPr>
+                <w:rFonts w:ascii="72" w:hAnsi="72" w:cs="72" w:eastAsia="72"/>
+                <w:b w:val="0"/>
+                <w:sz w:val="18"/>
+              </w:rPr>
+              <w:t>Navegação entre apps</w:t>
+            </w:r>
+          </w:p>
+        </w:tc>
+        <w:tc>
+          <w:tcPr>
+            <w:tcW w:type="dxa" w:w="3360"/>
+          </w:tcPr>
+          <w:p>
+            <w:r>
+              <w:rPr>
+                <w:rFonts w:ascii="Consolas" w:hAnsi="Consolas" w:cs="Consolas" w:eastAsia="Consolas"/>
+                <w:b w:val="0"/>
+                <w:sz w:val="16"/>
+              </w:rPr>
+              <w:t>Cliente e item do pedido</w:t>
+            </w:r>
+            <w:r>
+              <w:rPr>
+                <w:rFonts w:ascii="72" w:hAnsi="72" w:cs="72" w:eastAsia="72"/>
+                <w:b w:val="0"/>
+                <w:sz w:val="18"/>
+              </w:rPr>
+            </w:r>
+            <w:r>
+              <w:rPr>
+                <w:rFonts w:ascii="Consolas" w:hAnsi="Consolas" w:cs="Consolas" w:eastAsia="Consolas"/>
+                <w:b w:val="0"/>
+                <w:sz w:val="16"/>
+              </w:rPr>
+            </w:r>
+            <w:r>
+              <w:rPr>
+                <w:rFonts w:ascii="72" w:hAnsi="72" w:cs="72" w:eastAsia="72"/>
+                <w:b w:val="0"/>
+                <w:sz w:val="18"/>
+              </w:rPr>
+            </w:r>
+            <w:r>
+              <w:rPr>
+                <w:rFonts w:ascii="Consolas" w:hAnsi="Consolas" w:cs="Consolas" w:eastAsia="Consolas"/>
+                <w:b w:val="0"/>
+                <w:sz w:val="16"/>
+              </w:rPr>
+            </w:r>
+            <w:r>
+              <w:rPr>
+                <w:rFonts w:ascii="72" w:hAnsi="72" w:cs="72" w:eastAsia="72"/>
+                <w:b w:val="0"/>
+                <w:sz w:val="18"/>
+              </w:rPr>
+            </w:r>
+            <w:r>
+              <w:rPr>
+                <w:rFonts w:ascii="Consolas" w:hAnsi="Consolas" w:cs="Consolas" w:eastAsia="Consolas"/>
+                <w:b w:val="0"/>
+                <w:sz w:val="16"/>
+              </w:rPr>
+            </w:r>
+            <w:r>
+              <w:rPr>
+                <w:rFonts w:ascii="72" w:hAnsi="72" w:cs="72" w:eastAsia="72"/>
+                <w:b w:val="0"/>
+                <w:sz w:val="18"/>
+              </w:rPr>
+            </w:r>
+            <w:r>
+              <w:rPr>
+                <w:rFonts w:ascii="Consolas" w:hAnsi="Consolas" w:cs="Consolas" w:eastAsia="Consolas"/>
+                <w:b w:val="0"/>
+                <w:sz w:val="16"/>
+              </w:rPr>
+            </w:r>
+          </w:p>
+        </w:tc>
+        <w:tc>
+          <w:tcPr>
+            <w:tcW w:type="dxa" w:w="3360"/>
+          </w:tcPr>
+          <w:p>
+            <w:r>
+              <w:rPr>
+                <w:rFonts w:ascii="Consolas" w:hAnsi="Consolas" w:cs="Consolas" w:eastAsia="Consolas"/>
+                <w:b w:val="0"/>
+                <w:sz w:val="16"/>
+              </w:rPr>
+              <w:t>Pedido → Cliente (Cliente, CPF) e Item (Item, SKU); Reembolso → Pedido e Cliente (Cliente, CPF), abrindo direto o registro (seção 15.4)</w:t>
+            </w:r>
+            <w:r>
+              <w:rPr>
+                <w:rFonts w:ascii="72" w:hAnsi="72" w:cs="72" w:eastAsia="72"/>
+                <w:b w:val="0"/>
+                <w:sz w:val="18"/>
+              </w:rPr>
+            </w:r>
+            <w:r>
+              <w:rPr>
+                <w:rFonts w:ascii="Consolas" w:hAnsi="Consolas" w:cs="Consolas" w:eastAsia="Consolas"/>
+                <w:b w:val="0"/>
+                <w:sz w:val="16"/>
+              </w:rPr>
+            </w:r>
+            <w:r>
+              <w:rPr>
+                <w:rFonts w:ascii="72" w:hAnsi="72" w:cs="72" w:eastAsia="72"/>
+                <w:b w:val="0"/>
+                <w:sz w:val="18"/>
+              </w:rPr>
+            </w:r>
+            <w:r>
+              <w:rPr>
+                <w:rFonts w:ascii="Consolas" w:hAnsi="Consolas" w:cs="Consolas" w:eastAsia="Consolas"/>
+                <w:b w:val="0"/>
+                <w:sz w:val="16"/>
+              </w:rPr>
+            </w:r>
+            <w:r>
+              <w:rPr>
+                <w:rFonts w:ascii="72" w:hAnsi="72" w:cs="72" w:eastAsia="72"/>
+                <w:b w:val="0"/>
+                <w:sz w:val="18"/>
+              </w:rPr>
+            </w:r>
+            <w:r>
+              <w:rPr>
+                <w:rFonts w:ascii="Consolas" w:hAnsi="Consolas" w:cs="Consolas" w:eastAsia="Consolas"/>
+                <w:b w:val="0"/>
+                <w:sz w:val="16"/>
+              </w:rPr>
+            </w:r>
+            <w:r>
+              <w:rPr>
+                <w:rFonts w:ascii="72" w:hAnsi="72" w:cs="72" w:eastAsia="72"/>
+                <w:b w:val="0"/>
+                <w:sz w:val="18"/>
+              </w:rPr>
+            </w:r>
+            <w:r>
+              <w:rPr>
+                <w:rFonts w:ascii="Consolas" w:hAnsi="Consolas" w:cs="Consolas" w:eastAsia="Consolas"/>
+                <w:b w:val="0"/>
+                <w:sz w:val="16"/>
+              </w:rPr>
+            </w:r>
+          </w:p>
+        </w:tc>
+      </w:tr>
+      <w:tr>
+        <w:tc>
+          <w:tcPr>
+            <w:tcW w:type="dxa" w:w="3360"/>
+          </w:tcPr>
+          <w:p>
+            <w:r>
+              <w:rPr>
+                <w:rFonts w:ascii="72" w:hAnsi="72" w:cs="72" w:eastAsia="72"/>
+                <w:b w:val="0"/>
+                <w:sz w:val="18"/>
+              </w:rPr>
+              <w:t>Importação de pedidos</w:t>
+            </w:r>
+          </w:p>
+        </w:tc>
+        <w:tc>
+          <w:tcPr>
+            <w:tcW w:type="dxa" w:w="3360"/>
+          </w:tcPr>
+          <w:p>
+            <w:r>
+              <w:rPr>
+                <w:rFonts w:ascii="Consolas" w:hAnsi="Consolas" w:cs="Consolas" w:eastAsia="Consolas"/>
+                <w:b w:val="0"/>
+                <w:sz w:val="16"/>
+              </w:rPr>
+              <w:t>A mesma planilha podia ser importada várias vezes</w:t>
+            </w:r>
+            <w:r>
+              <w:rPr>
+                <w:rFonts w:ascii="72" w:hAnsi="72" w:cs="72" w:eastAsia="72"/>
+                <w:b w:val="0"/>
+                <w:sz w:val="18"/>
+              </w:rPr>
+            </w:r>
+            <w:r>
+              <w:rPr>
+                <w:rFonts w:ascii="Consolas" w:hAnsi="Consolas" w:cs="Consolas" w:eastAsia="Consolas"/>
+                <w:b w:val="0"/>
+                <w:sz w:val="16"/>
+              </w:rPr>
+            </w:r>
+            <w:r>
+              <w:rPr>
+                <w:rFonts w:ascii="72" w:hAnsi="72" w:cs="72" w:eastAsia="72"/>
+                <w:b w:val="0"/>
+                <w:sz w:val="18"/>
+              </w:rPr>
+            </w:r>
+            <w:r>
+              <w:rPr>
+                <w:rFonts w:ascii="Consolas" w:hAnsi="Consolas" w:cs="Consolas" w:eastAsia="Consolas"/>
+                <w:b w:val="0"/>
+                <w:sz w:val="16"/>
+              </w:rPr>
+            </w:r>
+            <w:r>
+              <w:rPr>
+                <w:rFonts w:ascii="72" w:hAnsi="72" w:cs="72" w:eastAsia="72"/>
+                <w:b w:val="0"/>
+                <w:sz w:val="18"/>
+              </w:rPr>
+            </w:r>
+            <w:r>
+              <w:rPr>
+                <w:rFonts w:ascii="Consolas" w:hAnsi="Consolas" w:cs="Consolas" w:eastAsia="Consolas"/>
+                <w:b w:val="0"/>
+                <w:sz w:val="16"/>
+              </w:rPr>
+            </w:r>
+            <w:r>
+              <w:rPr>
+                <w:rFonts w:ascii="72" w:hAnsi="72" w:cs="72" w:eastAsia="72"/>
+                <w:b w:val="0"/>
+                <w:sz w:val="18"/>
+              </w:rPr>
+            </w:r>
+            <w:r>
+              <w:rPr>
+                <w:rFonts w:ascii="Consolas" w:hAnsi="Consolas" w:cs="Consolas" w:eastAsia="Consolas"/>
+                <w:b w:val="0"/>
+                <w:sz w:val="16"/>
+              </w:rPr>
+            </w:r>
+          </w:p>
+        </w:tc>
+        <w:tc>
+          <w:tcPr>
+            <w:tcW w:type="dxa" w:w="3360"/>
+          </w:tcPr>
+          <w:p>
+            <w:r>
+              <w:rPr>
+                <w:rFonts w:ascii="Consolas" w:hAnsi="Consolas" w:cs="Consolas" w:eastAsia="Consolas"/>
+                <w:b w:val="0"/>
+                <w:sz w:val="16"/>
+              </w:rPr>
+              <w:t>referenciaImportacao (coluna Pedido) como chave de idempotência por cliente (seção 13.2)</w:t>
+            </w:r>
+            <w:r>
+              <w:rPr>
+                <w:rFonts w:ascii="72" w:hAnsi="72" w:cs="72" w:eastAsia="72"/>
+                <w:b w:val="0"/>
+                <w:sz w:val="18"/>
+              </w:rPr>
+            </w:r>
+            <w:r>
+              <w:rPr>
+                <w:rFonts w:ascii="Consolas" w:hAnsi="Consolas" w:cs="Consolas" w:eastAsia="Consolas"/>
+                <w:b w:val="0"/>
+                <w:sz w:val="16"/>
+              </w:rPr>
+            </w:r>
+            <w:r>
+              <w:rPr>
+                <w:rFonts w:ascii="72" w:hAnsi="72" w:cs="72" w:eastAsia="72"/>
+                <w:b w:val="0"/>
+                <w:sz w:val="18"/>
+              </w:rPr>
+            </w:r>
+            <w:r>
+              <w:rPr>
+                <w:rFonts w:ascii="Consolas" w:hAnsi="Consolas" w:cs="Consolas" w:eastAsia="Consolas"/>
+                <w:b w:val="0"/>
+                <w:sz w:val="16"/>
+              </w:rPr>
+            </w:r>
+            <w:r>
+              <w:rPr>
+                <w:rFonts w:ascii="72" w:hAnsi="72" w:cs="72" w:eastAsia="72"/>
+                <w:b w:val="0"/>
+                <w:sz w:val="18"/>
+              </w:rPr>
+            </w:r>
+            <w:r>
+              <w:rPr>
+                <w:rFonts w:ascii="Consolas" w:hAnsi="Consolas" w:cs="Consolas" w:eastAsia="Consolas"/>
+                <w:b w:val="0"/>
+                <w:sz w:val="16"/>
+              </w:rPr>
+            </w:r>
+            <w:r>
+              <w:rPr>
+                <w:rFonts w:ascii="72" w:hAnsi="72" w:cs="72" w:eastAsia="72"/>
+                <w:b w:val="0"/>
+                <w:sz w:val="18"/>
+              </w:rPr>
+            </w:r>
+            <w:r>
+              <w:rPr>
+                <w:rFonts w:ascii="Consolas" w:hAnsi="Consolas" w:cs="Consolas" w:eastAsia="Consolas"/>
+                <w:b w:val="0"/>
+                <w:sz w:val="16"/>
+              </w:rPr>
+            </w:r>
+          </w:p>
+        </w:tc>
+      </w:tr>
+      <w:tr>
+        <w:tc>
+          <w:tcPr>
+            <w:tcW w:type="dxa" w:w="3360"/>
+          </w:tcPr>
+          <w:p>
+            <w:r>
+              <w:rPr>
+                <w:rFonts w:ascii="72" w:hAnsi="72" w:cs="72" w:eastAsia="72"/>
+                <w:b w:val="0"/>
+                <w:sz w:val="18"/>
+              </w:rPr>
+              <w:t>Testes</w:t>
+            </w:r>
+          </w:p>
+        </w:tc>
+        <w:tc>
+          <w:tcPr>
+            <w:tcW w:type="dxa" w:w="3360"/>
+          </w:tcPr>
+          <w:p>
+            <w:r>
+              <w:rPr>
+                <w:rFonts w:ascii="Consolas" w:hAnsi="Consolas" w:cs="Consolas" w:eastAsia="Consolas"/>
+                <w:b w:val="0"/>
+                <w:sz w:val="16"/>
+              </w:rPr>
+              <w:t>63 por versão</w:t>
+            </w:r>
+            <w:r>
+              <w:rPr>
+                <w:rFonts w:ascii="72" w:hAnsi="72" w:cs="72" w:eastAsia="72"/>
+                <w:b w:val="0"/>
+                <w:sz w:val="18"/>
+              </w:rPr>
+            </w:r>
+            <w:r>
+              <w:rPr>
+                <w:rFonts w:ascii="Consolas" w:hAnsi="Consolas" w:cs="Consolas" w:eastAsia="Consolas"/>
+                <w:b w:val="0"/>
+                <w:sz w:val="16"/>
+              </w:rPr>
+            </w:r>
+            <w:r>
+              <w:rPr>
+                <w:rFonts w:ascii="72" w:hAnsi="72" w:cs="72" w:eastAsia="72"/>
+                <w:b w:val="0"/>
+                <w:sz w:val="18"/>
+              </w:rPr>
+            </w:r>
+            <w:r>
+              <w:rPr>
+                <w:rFonts w:ascii="Consolas" w:hAnsi="Consolas" w:cs="Consolas" w:eastAsia="Consolas"/>
+                <w:b w:val="0"/>
+                <w:sz w:val="16"/>
+              </w:rPr>
+            </w:r>
+            <w:r>
+              <w:rPr>
+                <w:rFonts w:ascii="72" w:hAnsi="72" w:cs="72" w:eastAsia="72"/>
+                <w:b w:val="0"/>
+                <w:sz w:val="18"/>
+              </w:rPr>
+            </w:r>
+            <w:r>
+              <w:rPr>
+                <w:rFonts w:ascii="Consolas" w:hAnsi="Consolas" w:cs="Consolas" w:eastAsia="Consolas"/>
+                <w:b w:val="0"/>
+                <w:sz w:val="16"/>
+              </w:rPr>
+            </w:r>
+            <w:r>
+              <w:rPr>
+                <w:rFonts w:ascii="72" w:hAnsi="72" w:cs="72" w:eastAsia="72"/>
+                <w:b w:val="0"/>
+                <w:sz w:val="18"/>
+              </w:rPr>
+            </w:r>
+            <w:r>
+              <w:rPr>
+                <w:rFonts w:ascii="Consolas" w:hAnsi="Consolas" w:cs="Consolas" w:eastAsia="Consolas"/>
+                <w:b w:val="0"/>
+                <w:sz w:val="16"/>
+              </w:rPr>
+            </w:r>
+          </w:p>
+        </w:tc>
+        <w:tc>
+          <w:tcPr>
+            <w:tcW w:type="dxa" w:w="3360"/>
+          </w:tcPr>
+          <w:p>
+            <w:r>
+              <w:rPr>
+                <w:rFonts w:ascii="Consolas" w:hAnsi="Consolas" w:cs="Consolas" w:eastAsia="Consolas"/>
+                <w:b w:val="0"/>
+                <w:sz w:val="16"/>
+              </w:rPr>
+              <w:t>68 por versão</w:t>
+            </w:r>
+            <w:r>
+              <w:rPr>
+                <w:rFonts w:ascii="72" w:hAnsi="72" w:cs="72" w:eastAsia="72"/>
+                <w:b w:val="0"/>
+                <w:sz w:val="18"/>
+              </w:rPr>
+            </w:r>
+            <w:r>
+              <w:rPr>
+                <w:rFonts w:ascii="Consolas" w:hAnsi="Consolas" w:cs="Consolas" w:eastAsia="Consolas"/>
+                <w:b w:val="0"/>
+                <w:sz w:val="16"/>
+              </w:rPr>
+            </w:r>
+            <w:r>
+              <w:rPr>
+                <w:rFonts w:ascii="72" w:hAnsi="72" w:cs="72" w:eastAsia="72"/>
+                <w:b w:val="0"/>
+                <w:sz w:val="18"/>
+              </w:rPr>
+            </w:r>
+            <w:r>
+              <w:rPr>
+                <w:rFonts w:ascii="Consolas" w:hAnsi="Consolas" w:cs="Consolas" w:eastAsia="Consolas"/>
+                <w:b w:val="0"/>
+                <w:sz w:val="16"/>
+              </w:rPr>
+            </w:r>
+            <w:r>
+              <w:rPr>
+                <w:rFonts w:ascii="72" w:hAnsi="72" w:cs="72" w:eastAsia="72"/>
+                <w:b w:val="0"/>
+                <w:sz w:val="18"/>
+              </w:rPr>
+            </w:r>
+            <w:r>
+              <w:rPr>
+                <w:rFonts w:ascii="Consolas" w:hAnsi="Consolas" w:cs="Consolas" w:eastAsia="Consolas"/>
+                <w:b w:val="0"/>
+                <w:sz w:val="16"/>
+              </w:rPr>
+            </w:r>
+            <w:r>
+              <w:rPr>
+                <w:rFonts w:ascii="72" w:hAnsi="72" w:cs="72" w:eastAsia="72"/>
+                <w:b w:val="0"/>
+                <w:sz w:val="18"/>
+              </w:rPr>
+            </w:r>
+            <w:r>
+              <w:rPr>
+                <w:rFonts w:ascii="Consolas" w:hAnsi="Consolas" w:cs="Consolas" w:eastAsia="Consolas"/>
+                <w:b w:val="0"/>
+                <w:sz w:val="16"/>
+              </w:rPr>
             </w:r>
           </w:p>
         </w:tc>

</xml_diff>

<commit_message>
docs: especificação técnica 2.4 e histórico v1.7 no README
- Especificação (.md e .docx): transições de status do pedido na seção 10,
  mensagem PEDIDO_ALTERADO_CONCORRENTE, critério de aceite, depuração no
  VS Code (19.1), contagem de testes e revisão 2.4 no histórico.
- README: entrada v1.7, regra de concorrência e contagens de testes (72 em
  JavaScript, 74 em TypeScript) também nos READMEs das implementações.

Co-Authored-By: Claude Opus 5.5 <noreply@anthropic.com>
</commit_message>
<xml_diff>
--- a/docs/especificacao-tecnica.docx
+++ b/docs/especificacao-tecnica.docx
@@ -12,7 +12,7 @@
           <w:b/>
           <w:sz w:val="20"/>
         </w:rPr>
-        <w:t xml:space="preserve">Versão 2.3 — outubro de 2026.</w:t>
+        <w:t xml:space="preserve">Versão 2.4 — outubro de 2026.</w:t>
       </w:r>
       <w:r>
         <w:rPr>
@@ -68,7 +68,7 @@
           <w:b w:val="0"/>
           <w:sz w:val="20"/>
         </w:rPr>
-        <w:t xml:space="preserve"> (TypeScript). As duas compartilham o mesmo modelo CDS, os mesmos serviços, as mesmas aplicações SAPUI5 e a mesma suíte de testes; diferem apenas na linguagem dos handlers (seção 19). A seção 22 resume o que mudou em relação à versão 1 e nas revisões 2.1 (campos somente leitura no pedido, navegação entre apps e importação de pedidos sem duplicidade), 2.2 (análises em quatro apps, máscara no pagamento e navegações das Object Pages) e 2.3 (permissões na UI, ações recusadas no rascunho e proteções na importação).</w:t>
+        <w:t xml:space="preserve"> (TypeScript). As duas compartilham o mesmo modelo CDS, os mesmos serviços, as mesmas aplicações SAPUI5 e a mesma suíte de testes; diferem apenas na linguagem dos handlers (seção 19). A seção 22 resume o que mudou em relação à versão 1 e nas revisões 2.1 (campos somente leitura no pedido, navegação entre apps e importação de pedidos sem duplicidade), 2.2 (análises em quatro apps, máscara no pagamento e navegações das Object Pages), 2.3 (permissões na UI, ações recusadas no rascunho e proteções na importação) e 2.4 (transições de status atômicas nas ações do pedido e depuração no VS Code).</w:t>
       </w:r>
     </w:p>
     <w:p>
@@ -1118,7 +1118,7 @@
                 <w:b w:val="0"/>
                 <w:sz w:val="18"/>
               </w:rPr>
-              <w:t xml:space="preserve"> (71 testes em JavaScript, 73 em TypeScript), ESLint 10</w:t>
+              <w:t xml:space="preserve"> (72 testes em JavaScript, 74 em TypeScript), ESLint 10</w:t>
             </w:r>
           </w:p>
         </w:tc>
@@ -13857,7 +13857,7 @@
                 <w:b w:val="0"/>
                 <w:sz w:val="18"/>
               </w:rPr>
-              <w:t>Registro, edição, snapshots, cancelamento, reembolso, pagamento</w:t>
+              <w:t xml:space="preserve">Registro, edição, pagamento, aprovação, cancelamento, reembolso, snapshots e transições atômicas de status</w:t>
             </w:r>
           </w:p>
         </w:tc>
@@ -18730,7 +18730,214 @@
           <w:b w:val="0"/>
           <w:sz w:val="20"/>
         </w:rPr>
-        <w:t>. Como toda a requisição roda numa transação, qualquer erro desfaz também os movimentos já aplicados, o número do pedido e os snapshots — não há dupla reserva, dupla baixa ou dupla liberação.</w:t>
+        <w:t xml:space="preserve">. Como toda a requisição roda numa transação, qualquer erro desfaz também os movimentos já aplicados, o número do pedido e os snapshots.</w:t>
+      </w:r>
+    </w:p>
+    <w:p>
+      <w:pPr/>
+      <w:r>
+        <w:rPr>
+          <w:rFonts w:ascii="72" w:hAnsi="72" w:cs="72" w:eastAsia="72"/>
+          <w:b/>
+          <w:sz w:val="20"/>
+        </w:rPr>
+        <w:t xml:space="preserve">Transições de status do pedido:</w:t>
+      </w:r>
+      <w:r>
+        <w:rPr>
+          <w:rFonts w:ascii="72" w:hAnsi="72" w:cs="72" w:eastAsia="72"/>
+          <w:b w:val="0"/>
+          <w:sz w:val="20"/>
+        </w:rPr>
+        <w:t xml:space="preserve"> duas ações podem ler o mesmo pedido ao mesmo tempo (ex.: dois cancelamentos, ou pagar e cancelar). Por isso toda ação começa por </w:t>
+      </w:r>
+      <w:r>
+        <w:rPr>
+          <w:rFonts w:ascii="Consolas" w:hAnsi="Consolas" w:cs="Consolas" w:eastAsia="Consolas"/>
+          <w:b w:val="0"/>
+          <w:sz w:val="18"/>
+        </w:rPr>
+        <w:t xml:space="preserve">transicionarPedido</w:t>
+      </w:r>
+      <w:r>
+        <w:rPr>
+          <w:rFonts w:ascii="72" w:hAnsi="72" w:cs="72" w:eastAsia="72"/>
+          <w:b w:val="0"/>
+          <w:sz w:val="20"/>
+        </w:rPr>
+        <w:t xml:space="preserve"> (</w:t>
+      </w:r>
+      <w:r>
+        <w:rPr>
+          <w:rFonts w:ascii="Consolas" w:hAnsi="Consolas" w:cs="Consolas" w:eastAsia="Consolas"/>
+          <w:b w:val="0"/>
+          <w:sz w:val="18"/>
+        </w:rPr>
+        <w:t xml:space="preserve">srv/lib/pedidos</w:t>
+      </w:r>
+      <w:r>
+        <w:rPr>
+          <w:rFonts w:ascii="72" w:hAnsi="72" w:cs="72" w:eastAsia="72"/>
+          <w:b w:val="0"/>
+          <w:sz w:val="20"/>
+        </w:rPr>
+        <w:t xml:space="preserve">), um </w:t>
+      </w:r>
+      <w:r>
+        <w:rPr>
+          <w:rFonts w:ascii="Consolas" w:hAnsi="Consolas" w:cs="Consolas" w:eastAsia="Consolas"/>
+          <w:b w:val="0"/>
+          <w:sz w:val="18"/>
+        </w:rPr>
+        <w:t xml:space="preserve">UPDATE Pedidos SET ... WHERE ID = ? AND statusPedido_code = ? AND statusPagamento_code = ?</w:t>
+      </w:r>
+      <w:r>
+        <w:rPr>
+          <w:rFonts w:ascii="72" w:hAnsi="72" w:cs="72" w:eastAsia="72"/>
+          <w:b w:val="0"/>
+          <w:sz w:val="20"/>
+        </w:rPr>
+        <w:t xml:space="preserve"> com o estado lido no início da ação. O </w:t>
+      </w:r>
+      <w:r>
+        <w:rPr>
+          <w:rFonts w:ascii="Consolas" w:hAnsi="Consolas" w:cs="Consolas" w:eastAsia="Consolas"/>
+          <w:b w:val="0"/>
+          <w:sz w:val="18"/>
+        </w:rPr>
+        <w:t xml:space="preserve">UPDATE</w:t>
+      </w:r>
+      <w:r>
+        <w:rPr>
+          <w:rFonts w:ascii="72" w:hAnsi="72" w:cs="72" w:eastAsia="72"/>
+          <w:b w:val="0"/>
+          <w:sz w:val="20"/>
+        </w:rPr>
+        <w:t xml:space="preserve"> também bloqueia a linha até o fim da transação. Só a primeira ação muda o status; a outra recebe </w:t>
+      </w:r>
+      <w:r>
+        <w:rPr>
+          <w:rFonts w:ascii="Consolas" w:hAnsi="Consolas" w:cs="Consolas" w:eastAsia="Consolas"/>
+          <w:b w:val="0"/>
+          <w:sz w:val="18"/>
+        </w:rPr>
+        <w:t xml:space="preserve">PEDIDO_ALTERADO_CONCORRENTE</w:t>
+      </w:r>
+      <w:r>
+        <w:rPr>
+          <w:rFonts w:ascii="72" w:hAnsi="72" w:cs="72" w:eastAsia="72"/>
+          <w:b w:val="0"/>
+          <w:sz w:val="20"/>
+        </w:rPr>
+        <w:t xml:space="preserve"> (HTTP 409) antes de mexer no estoque, no pagamento ou nos snapshots, então não há dupla reserva, dupla baixa ou dupla liberação. A mesma conferência vale para:</w:t>
+      </w:r>
+    </w:p>
+    <w:p>
+      <w:pPr>
+        <w:pStyle w:val="Commarcadores"/>
+      </w:pPr>
+      <w:r>
+        <w:rPr>
+          <w:rFonts w:ascii="72" w:hAnsi="72" w:cs="72" w:eastAsia="72"/>
+          <w:b w:val="0"/>
+          <w:sz w:val="20"/>
+        </w:rPr>
+        <w:t xml:space="preserve">o </w:t>
+      </w:r>
+      <w:r>
+        <w:rPr>
+          <w:rFonts w:ascii="72" w:hAnsi="72" w:cs="72" w:eastAsia="72"/>
+          <w:b w:val="0"/>
+          <w:sz w:val="20"/>
+          <w:i/>
+        </w:rPr>
+        <w:t xml:space="preserve">Save da edição</w:t>
+      </w:r>
+      <w:r>
+        <w:rPr>
+          <w:rFonts w:ascii="72" w:hAnsi="72" w:cs="72" w:eastAsia="72"/>
+          <w:b w:val="0"/>
+          <w:sz w:val="20"/>
+        </w:rPr>
+        <w:t xml:space="preserve"> do pedido, que só ajusta a reserva se o pedido continua </w:t>
+      </w:r>
+      <w:r>
+        <w:rPr>
+          <w:rFonts w:ascii="Consolas" w:hAnsi="Consolas" w:cs="Consolas" w:eastAsia="Consolas"/>
+          <w:b w:val="0"/>
+          <w:sz w:val="18"/>
+        </w:rPr>
+        <w:t xml:space="preserve">ABERTO</w:t>
+      </w:r>
+      <w:r>
+        <w:rPr>
+          <w:rFonts w:ascii="72" w:hAnsi="72" w:cs="72" w:eastAsia="72"/>
+          <w:b w:val="0"/>
+          <w:sz w:val="20"/>
+        </w:rPr>
+        <w:t xml:space="preserve">;</w:t>
+      </w:r>
+    </w:p>
+    <w:p>
+      <w:pPr>
+        <w:pStyle w:val="Commarcadores"/>
+      </w:pPr>
+      <w:r>
+        <w:rPr>
+          <w:rFonts w:ascii="72" w:hAnsi="72" w:cs="72" w:eastAsia="72"/>
+          <w:b w:val="0"/>
+          <w:sz w:val="20"/>
+        </w:rPr>
+        <w:t xml:space="preserve">a </w:t>
+      </w:r>
+      <w:r>
+        <w:rPr>
+          <w:rFonts w:ascii="72" w:hAnsi="72" w:cs="72" w:eastAsia="72"/>
+          <w:b w:val="0"/>
+          <w:sz w:val="20"/>
+          <w:i/>
+        </w:rPr>
+        <w:t xml:space="preserve">decisão do reembolso</w:t>
+      </w:r>
+      <w:r>
+        <w:rPr>
+          <w:rFonts w:ascii="72" w:hAnsi="72" w:cs="72" w:eastAsia="72"/>
+          <w:b w:val="0"/>
+          <w:sz w:val="20"/>
+        </w:rPr>
+        <w:t xml:space="preserve">, gravada só se a solicitação ainda está </w:t>
+      </w:r>
+      <w:r>
+        <w:rPr>
+          <w:rFonts w:ascii="Consolas" w:hAnsi="Consolas" w:cs="Consolas" w:eastAsia="Consolas"/>
+          <w:b w:val="0"/>
+          <w:sz w:val="18"/>
+        </w:rPr>
+        <w:t xml:space="preserve">PENDENTE</w:t>
+      </w:r>
+      <w:r>
+        <w:rPr>
+          <w:rFonts w:ascii="72" w:hAnsi="72" w:cs="72" w:eastAsia="72"/>
+          <w:b w:val="0"/>
+          <w:sz w:val="20"/>
+        </w:rPr>
+        <w:t xml:space="preserve"> (de duas decisões simultâneas, a segunda recebe </w:t>
+      </w:r>
+      <w:r>
+        <w:rPr>
+          <w:rFonts w:ascii="Consolas" w:hAnsi="Consolas" w:cs="Consolas" w:eastAsia="Consolas"/>
+          <w:b w:val="0"/>
+          <w:sz w:val="18"/>
+        </w:rPr>
+        <w:t xml:space="preserve">REEMBOLSO_STATUS_INVALIDO</w:t>
+      </w:r>
+      <w:r>
+        <w:rPr>
+          <w:rFonts w:ascii="72" w:hAnsi="72" w:cs="72" w:eastAsia="72"/>
+          <w:b w:val="0"/>
+          <w:sz w:val="20"/>
+        </w:rPr>
+        <w:t xml:space="preserve">).</w:t>
       </w:r>
     </w:p>
     <w:tbl>
@@ -25390,6 +25597,38 @@
                 <w:b w:val="0"/>
                 <w:sz w:val="16"/>
               </w:rPr>
+              <w:t xml:space="preserve">PEDIDO_ALTERADO_CONCORRENTE</w:t>
+            </w:r>
+          </w:p>
+        </w:tc>
+        <w:tc>
+          <w:tcPr>
+            <w:tcW w:type="dxa" w:w="5040"/>
+          </w:tcPr>
+          <w:p>
+            <w:r>
+              <w:rPr>
+                <w:rFonts w:ascii="72" w:hAnsi="72" w:cs="72" w:eastAsia="72"/>
+                <w:b w:val="0"/>
+                <w:sz w:val="18"/>
+              </w:rPr>
+              <w:t xml:space="preserve">O pedido {numero} foi alterado por outra operação. Atualize a tela e tente novamente.</w:t>
+            </w:r>
+          </w:p>
+        </w:tc>
+      </w:tr>
+      <w:tr>
+        <w:tc>
+          <w:tcPr>
+            <w:tcW w:type="dxa" w:w="5040"/>
+          </w:tcPr>
+          <w:p>
+            <w:r>
+              <w:rPr>
+                <w:rFonts w:ascii="Consolas" w:hAnsi="Consolas" w:cs="Consolas" w:eastAsia="Consolas"/>
+                <w:b w:val="0"/>
+                <w:sz w:val="16"/>
+              </w:rPr>
               <w:t>ACAO_SOMENTE_ATIVO</w:t>
             </w:r>
           </w:p>
@@ -26987,6 +27226,35 @@
           <w:sz w:val="20"/>
         </w:rPr>
         <w:t xml:space="preserve">Dado um pedido em edição ou um rascunho, quando uma ação for executada, então é bloqueada (HTTP 409, ACAO_SOMENTE_ATIVO no rascunho).</w:t>
+      </w:r>
+    </w:p>
+    <w:p>
+      <w:pPr>
+        <w:pStyle w:val="Commarcadores"/>
+      </w:pPr>
+      <w:r>
+        <w:rPr>
+          <w:rFonts w:ascii="72" w:hAnsi="72" w:cs="72" w:eastAsia="72"/>
+          <w:b w:val="0"/>
+          <w:sz w:val="20"/>
+        </w:rPr>
+        <w:t xml:space="preserve">Dado duas ações simultâneas sobre o mesmo pedido (ex.: dois cancelamentos, ou pagar e cancelar), então só a primeira é aplicada; a outra é recusada com </w:t>
+      </w:r>
+      <w:r>
+        <w:rPr>
+          <w:rFonts w:ascii="Consolas" w:hAnsi="Consolas" w:cs="Consolas" w:eastAsia="Consolas"/>
+          <w:b w:val="0"/>
+          <w:sz w:val="18"/>
+        </w:rPr>
+        <w:t xml:space="preserve">PEDIDO_ALTERADO_CONCORRENTE</w:t>
+      </w:r>
+      <w:r>
+        <w:rPr>
+          <w:rFonts w:ascii="72" w:hAnsi="72" w:cs="72" w:eastAsia="72"/>
+          <w:b w:val="0"/>
+          <w:sz w:val="20"/>
+        </w:rPr>
+        <w:t xml:space="preserve"> sem alterar estoque, reserva, pagamento ou motivo.</w:t>
       </w:r>
     </w:p>
     <w:p>
@@ -28888,8 +29156,250 @@
           </w:p>
         </w:tc>
       </w:tr>
+      <w:tr>
+        <w:tc>
+          <w:tcPr>
+            <w:tcW w:type="dxa" w:w="3360"/>
+          </w:tcPr>
+          <w:p>
+            <w:r>
+              <w:rPr>
+                <w:rFonts w:ascii="72" w:hAnsi="72" w:cs="72" w:eastAsia="72"/>
+                <w:b w:val="0"/>
+                <w:sz w:val="18"/>
+              </w:rPr>
+              <w:t xml:space="preserve">Depurar (VS Code)</w:t>
+            </w:r>
+          </w:p>
+        </w:tc>
+        <w:tc>
+          <w:tcPr>
+            <w:tcW w:type="dxa" w:w="3360"/>
+          </w:tcPr>
+          <w:p>
+            <w:r>
+              <w:rPr>
+                <w:rFonts w:ascii="Consolas" w:hAnsi="Consolas" w:cs="Consolas" w:eastAsia="Consolas"/>
+                <w:b w:val="0"/>
+                <w:sz w:val="16"/>
+              </w:rPr>
+              <w:t xml:space="preserve">.vscode/launch.json</w:t>
+            </w:r>
+            <w:r>
+              <w:rPr>
+                <w:rFonts w:ascii="72" w:hAnsi="72" w:cs="72" w:eastAsia="72"/>
+                <w:b w:val="0"/>
+                <w:sz w:val="18"/>
+              </w:rPr>
+              <w:t xml:space="preserve">: servidor (</w:t>
+            </w:r>
+            <w:r>
+              <w:rPr>
+                <w:rFonts w:ascii="Consolas" w:hAnsi="Consolas" w:cs="Consolas" w:eastAsia="Consolas"/>
+                <w:b w:val="0"/>
+                <w:sz w:val="16"/>
+              </w:rPr>
+              <w:t xml:space="preserve">cds watch</w:t>
+            </w:r>
+            <w:r>
+              <w:rPr>
+                <w:rFonts w:ascii="72" w:hAnsi="72" w:cs="72" w:eastAsia="72"/>
+                <w:b w:val="0"/>
+                <w:sz w:val="18"/>
+              </w:rPr>
+              <w:t xml:space="preserve"> ou </w:t>
+            </w:r>
+            <w:r>
+              <w:rPr>
+                <w:rFonts w:ascii="Consolas" w:hAnsi="Consolas" w:cs="Consolas" w:eastAsia="Consolas"/>
+                <w:b w:val="0"/>
+                <w:sz w:val="16"/>
+              </w:rPr>
+              <w:t xml:space="preserve">cds serve</w:t>
+            </w:r>
+            <w:r>
+              <w:rPr>
+                <w:rFonts w:ascii="72" w:hAnsi="72" w:cs="72" w:eastAsia="72"/>
+                <w:b w:val="0"/>
+                <w:sz w:val="18"/>
+              </w:rPr>
+              <w:t xml:space="preserve">), todos os testes, teste do arquivo aberto, anexar a processo</w:t>
+            </w:r>
+          </w:p>
+        </w:tc>
+        <w:tc>
+          <w:tcPr>
+            <w:tcW w:type="dxa" w:w="3360"/>
+          </w:tcPr>
+          <w:p>
+            <w:r>
+              <w:rPr>
+                <w:rFonts w:ascii="72" w:hAnsi="72" w:cs="72" w:eastAsia="72"/>
+                <w:b w:val="0"/>
+                <w:sz w:val="18"/>
+              </w:rPr>
+              <w:t xml:space="preserve">Idem com </w:t>
+            </w:r>
+            <w:r>
+              <w:rPr>
+                <w:rFonts w:ascii="Consolas" w:hAnsi="Consolas" w:cs="Consolas" w:eastAsia="Consolas"/>
+                <w:b w:val="0"/>
+                <w:sz w:val="16"/>
+              </w:rPr>
+              <w:t xml:space="preserve">cds-tsx</w:t>
+            </w:r>
+            <w:r>
+              <w:rPr>
+                <w:rFonts w:ascii="72" w:hAnsi="72" w:cs="72" w:eastAsia="72"/>
+                <w:b w:val="0"/>
+                <w:sz w:val="18"/>
+              </w:rPr>
+              <w:t xml:space="preserve"> e </w:t>
+            </w:r>
+            <w:r>
+              <w:rPr>
+                <w:rFonts w:ascii="Consolas" w:hAnsi="Consolas" w:cs="Consolas" w:eastAsia="Consolas"/>
+                <w:b w:val="0"/>
+                <w:sz w:val="16"/>
+              </w:rPr>
+              <w:t xml:space="preserve">tsx</w:t>
+            </w:r>
+            <w:r>
+              <w:rPr>
+                <w:rFonts w:ascii="72" w:hAnsi="72" w:cs="72" w:eastAsia="72"/>
+                <w:b w:val="0"/>
+                <w:sz w:val="18"/>
+              </w:rPr>
+              <w:t xml:space="preserve"> (breakpoints direto nos </w:t>
+            </w:r>
+            <w:r>
+              <w:rPr>
+                <w:rFonts w:ascii="Consolas" w:hAnsi="Consolas" w:cs="Consolas" w:eastAsia="Consolas"/>
+                <w:b w:val="0"/>
+                <w:sz w:val="16"/>
+              </w:rPr>
+              <w:t xml:space="preserve">.ts</w:t>
+            </w:r>
+            <w:r>
+              <w:rPr>
+                <w:rFonts w:ascii="72" w:hAnsi="72" w:cs="72" w:eastAsia="72"/>
+                <w:b w:val="0"/>
+                <w:sz w:val="18"/>
+              </w:rPr>
+              <w:t xml:space="preserve">, com source maps)</w:t>
+            </w:r>
+          </w:p>
+        </w:tc>
+      </w:tr>
     </w:tbl>
     <w:p/>
+    <w:p>
+      <w:pPr/>
+      <w:r>
+        <w:rPr>
+          <w:rFonts w:ascii="72" w:hAnsi="72" w:cs="72" w:eastAsia="72"/>
+          <w:b w:val="0"/>
+          <w:sz w:val="20"/>
+        </w:rPr>
+        <w:t xml:space="preserve">Para depurar, abra a pasta da implementação (</w:t>
+      </w:r>
+      <w:r>
+        <w:rPr>
+          <w:rFonts w:ascii="Consolas" w:hAnsi="Consolas" w:cs="Consolas" w:eastAsia="Consolas"/>
+          <w:b w:val="0"/>
+          <w:sz w:val="18"/>
+        </w:rPr>
+        <w:t xml:space="preserve">nodejs-padrao</w:t>
+      </w:r>
+      <w:r>
+        <w:rPr>
+          <w:rFonts w:ascii="72" w:hAnsi="72" w:cs="72" w:eastAsia="72"/>
+          <w:b w:val="0"/>
+          <w:sz w:val="20"/>
+        </w:rPr>
+        <w:t xml:space="preserve"> ou </w:t>
+      </w:r>
+      <w:r>
+        <w:rPr>
+          <w:rFonts w:ascii="Consolas" w:hAnsi="Consolas" w:cs="Consolas" w:eastAsia="Consolas"/>
+          <w:b w:val="0"/>
+          <w:sz w:val="18"/>
+        </w:rPr>
+        <w:t xml:space="preserve">nodejs-typescript</w:t>
+      </w:r>
+      <w:r>
+        <w:rPr>
+          <w:rFonts w:ascii="72" w:hAnsi="72" w:cs="72" w:eastAsia="72"/>
+          <w:b w:val="0"/>
+          <w:sz w:val="20"/>
+        </w:rPr>
+        <w:t xml:space="preserve">) como workspace no VS Code e rode </w:t>
+      </w:r>
+      <w:r>
+        <w:rPr>
+          <w:rFonts w:ascii="Consolas" w:hAnsi="Consolas" w:cs="Consolas" w:eastAsia="Consolas"/>
+          <w:b w:val="0"/>
+          <w:sz w:val="18"/>
+        </w:rPr>
+        <w:t xml:space="preserve">npm install</w:t>
+      </w:r>
+      <w:r>
+        <w:rPr>
+          <w:rFonts w:ascii="72" w:hAnsi="72" w:cs="72" w:eastAsia="72"/>
+          <w:b w:val="0"/>
+          <w:sz w:val="20"/>
+        </w:rPr>
+        <w:t xml:space="preserve">. As configurações usam os executáveis locais de </w:t>
+      </w:r>
+      <w:r>
+        <w:rPr>
+          <w:rFonts w:ascii="Consolas" w:hAnsi="Consolas" w:cs="Consolas" w:eastAsia="Consolas"/>
+          <w:b w:val="0"/>
+          <w:sz w:val="18"/>
+        </w:rPr>
+        <w:t xml:space="preserve">node_modules/.bin</w:t>
+      </w:r>
+      <w:r>
+        <w:rPr>
+          <w:rFonts w:ascii="72" w:hAnsi="72" w:cs="72" w:eastAsia="72"/>
+          <w:b w:val="0"/>
+          <w:sz w:val="20"/>
+        </w:rPr>
+        <w:t xml:space="preserve"> e anexam automaticamente os processos filhos do </w:t>
+      </w:r>
+      <w:r>
+        <w:rPr>
+          <w:rFonts w:ascii="Consolas" w:hAnsi="Consolas" w:cs="Consolas" w:eastAsia="Consolas"/>
+          <w:b w:val="0"/>
+          <w:sz w:val="18"/>
+        </w:rPr>
+        <w:t xml:space="preserve">watch</w:t>
+      </w:r>
+      <w:r>
+        <w:rPr>
+          <w:rFonts w:ascii="72" w:hAnsi="72" w:cs="72" w:eastAsia="72"/>
+          <w:b w:val="0"/>
+          <w:sz w:val="20"/>
+        </w:rPr>
+        <w:t xml:space="preserve"> e do </w:t>
+      </w:r>
+      <w:r>
+        <w:rPr>
+          <w:rFonts w:ascii="Consolas" w:hAnsi="Consolas" w:cs="Consolas" w:eastAsia="Consolas"/>
+          <w:b w:val="0"/>
+          <w:sz w:val="18"/>
+        </w:rPr>
+        <w:t xml:space="preserve">node --test</w:t>
+      </w:r>
+      <w:r>
+        <w:rPr>
+          <w:rFonts w:ascii="72" w:hAnsi="72" w:cs="72" w:eastAsia="72"/>
+          <w:b w:val="0"/>
+          <w:sz w:val="20"/>
+        </w:rPr>
+        <w:t xml:space="preserve">.</w:t>
+      </w:r>
+    </w:p>
     <w:p>
       <w:pPr>
         <w:pStyle w:val="Ttulo1"/>
@@ -28911,7 +29421,7 @@
           <w:b w:val="0"/>
           <w:sz w:val="20"/>
         </w:rPr>
-        <w:t xml:space="preserve">71 testes na versão JavaScript e 73 na TypeScript (</w:t>
+        <w:t xml:space="preserve">72 testes na versão JavaScript e 74 na TypeScript (</w:t>
       </w:r>
       <w:r>
         <w:rPr>
@@ -29135,7 +29645,7 @@
                 <w:b w:val="0"/>
                 <w:sz w:val="18"/>
               </w:rPr>
-              <w:t xml:space="preserve">Registro com reserva, edição pela diferença, pagamento, aprovação, cancelamento (inclusive ações recusadas no rascunho), reembolso, campos somente leitura (cliente e pagamento)</w:t>
+              <w:t xml:space="preserve">Registro com reserva, edição pela diferença, pagamento, aprovação, cancelamento (inclusive ações recusadas no rascunho e ações com o pedido alterado por outra operação), reembolso, campos somente leitura (cliente e pagamento)</w:t>
             </w:r>
           </w:p>
         </w:tc>
@@ -32408,6 +32918,436 @@
                 <w:sz w:val="18"/>
               </w:rPr>
               <w:t xml:space="preserve">71 (JavaScript) e 73 (TypeScript)</w:t>
+            </w:r>
+          </w:p>
+        </w:tc>
+      </w:tr>
+    </w:tbl>
+    <w:p/>
+    <w:p>
+      <w:pPr>
+        <w:pStyle w:val="Ttulo2"/>
+      </w:pPr>
+      <w:r>
+        <w:rPr>
+          <w:rFonts w:ascii="72" w:hAnsi="72" w:cs="72" w:eastAsia="72"/>
+          <w:b w:val="0"/>
+          <w:sz w:val="26"/>
+        </w:rPr>
+        <w:t xml:space="preserve">22.5 Revisão 2.4</w:t>
+      </w:r>
+    </w:p>
+    <w:tbl>
+      <w:tblPr>
+        <w:tblStyle w:val="Tabelacomgrade"/>
+        <w:tblW w:type="auto" w:w="0"/>
+        <w:jc w:val="center"/>
+        <w:tblLook w:firstColumn="1" w:firstRow="1" w:lastColumn="0" w:lastRow="0" w:noHBand="0" w:noVBand="1" w:val="04A0"/>
+      </w:tblPr>
+      <w:tblGrid>
+        <w:gridCol w:w="3360"/>
+        <w:gridCol w:w="3360"/>
+        <w:gridCol w:w="3360"/>
+      </w:tblGrid>
+      <w:tr>
+        <w:trPr>
+          <w:tblHeader w:val="true"/>
+        </w:trPr>
+        <w:tc>
+          <w:tcPr>
+            <w:tcW w:type="dxa" w:w="3360"/>
+            <w:shd w:val="clear" w:color="auto" w:fill="0070F2"/>
+          </w:tcPr>
+          <w:p>
+            <w:r>
+              <w:rPr>
+                <w:rFonts w:ascii="72" w:hAnsi="72" w:cs="72" w:eastAsia="72"/>
+                <w:b/>
+                <w:color w:val="FFFFFF"/>
+                <w:sz w:val="20"/>
+              </w:rPr>
+              <w:t>Tema</w:t>
+            </w:r>
+          </w:p>
+        </w:tc>
+        <w:tc>
+          <w:tcPr>
+            <w:tcW w:type="dxa" w:w="3360"/>
+            <w:shd w:val="clear" w:color="auto" w:fill="0070F2"/>
+          </w:tcPr>
+          <w:p>
+            <w:r>
+              <w:rPr>
+                <w:rFonts w:ascii="72" w:hAnsi="72" w:cs="72" w:eastAsia="72"/>
+                <w:b/>
+                <w:color w:val="FFFFFF"/>
+                <w:sz w:val="20"/>
+              </w:rPr>
+              <w:t xml:space="preserve">Versão 2.3</w:t>
+            </w:r>
+          </w:p>
+        </w:tc>
+        <w:tc>
+          <w:tcPr>
+            <w:tcW w:type="dxa" w:w="3360"/>
+            <w:shd w:val="clear" w:color="auto" w:fill="0070F2"/>
+          </w:tcPr>
+          <w:p>
+            <w:r>
+              <w:rPr>
+                <w:rFonts w:ascii="72" w:hAnsi="72" w:cs="72" w:eastAsia="72"/>
+                <w:b/>
+                <w:color w:val="FFFFFF"/>
+                <w:sz w:val="20"/>
+              </w:rPr>
+              <w:t xml:space="preserve">Versão 2.4</w:t>
+            </w:r>
+          </w:p>
+        </w:tc>
+      </w:tr>
+      <w:tr>
+        <w:tc>
+          <w:tcPr>
+            <w:tcW w:type="dxa" w:w="3360"/>
+          </w:tcPr>
+          <w:p>
+            <w:r>
+              <w:rPr>
+                <w:rFonts w:ascii="72" w:hAnsi="72" w:cs="72" w:eastAsia="72"/>
+                <w:b w:val="0"/>
+                <w:sz w:val="18"/>
+              </w:rPr>
+              <w:t xml:space="preserve">Ações simultâneas no pedido</w:t>
+            </w:r>
+          </w:p>
+        </w:tc>
+        <w:tc>
+          <w:tcPr>
+            <w:tcW w:type="dxa" w:w="3360"/>
+          </w:tcPr>
+          <w:p>
+            <w:r>
+              <w:rPr>
+                <w:rFonts w:ascii="72" w:hAnsi="72" w:cs="72" w:eastAsia="72"/>
+                <w:b w:val="0"/>
+                <w:sz w:val="18"/>
+              </w:rPr>
+              <w:t xml:space="preserve">A ação mudava o status no fim, sem conferir o status lido; um segundo cancelamento simultâneo liberava a reserva de novo (consumindo reservas de outros pedidos)</w:t>
+            </w:r>
+          </w:p>
+        </w:tc>
+        <w:tc>
+          <w:tcPr>
+            <w:tcW w:type="dxa" w:w="3360"/>
+          </w:tcPr>
+          <w:p>
+            <w:r>
+              <w:rPr>
+                <w:rFonts w:ascii="72" w:hAnsi="72" w:cs="72" w:eastAsia="72"/>
+                <w:b w:val="0"/>
+                <w:sz w:val="18"/>
+              </w:rPr>
+              <w:t xml:space="preserve">Transição de status atômica no início de cada ação; a ação que perde a corrida recebe </w:t>
+            </w:r>
+            <w:r>
+              <w:rPr>
+                <w:rFonts w:ascii="Consolas" w:hAnsi="Consolas" w:cs="Consolas" w:eastAsia="Consolas"/>
+                <w:b w:val="0"/>
+                <w:sz w:val="16"/>
+              </w:rPr>
+              <w:t xml:space="preserve">PEDIDO_ALTERADO_CONCORRENTE</w:t>
+            </w:r>
+            <w:r>
+              <w:rPr>
+                <w:rFonts w:ascii="72" w:hAnsi="72" w:cs="72" w:eastAsia="72"/>
+                <w:b w:val="0"/>
+                <w:sz w:val="18"/>
+              </w:rPr>
+              <w:t xml:space="preserve"> sem efeito (seção 10)</w:t>
+            </w:r>
+          </w:p>
+        </w:tc>
+      </w:tr>
+      <w:tr>
+        <w:tc>
+          <w:tcPr>
+            <w:tcW w:type="dxa" w:w="3360"/>
+          </w:tcPr>
+          <w:p>
+            <w:r>
+              <w:rPr>
+                <w:rFonts w:ascii="72" w:hAnsi="72" w:cs="72" w:eastAsia="72"/>
+                <w:b w:val="0"/>
+                <w:sz w:val="18"/>
+              </w:rPr>
+              <w:t xml:space="preserve">Decisão do reembolso</w:t>
+            </w:r>
+          </w:p>
+        </w:tc>
+        <w:tc>
+          <w:tcPr>
+            <w:tcW w:type="dxa" w:w="3360"/>
+          </w:tcPr>
+          <w:p>
+            <w:r>
+              <w:rPr>
+                <w:rFonts w:ascii="72" w:hAnsi="72" w:cs="72" w:eastAsia="72"/>
+                <w:b w:val="0"/>
+                <w:sz w:val="18"/>
+              </w:rPr>
+              <w:t xml:space="preserve">Gravada depois do lado do pedido, sem conferir a solicitação</w:t>
+            </w:r>
+          </w:p>
+        </w:tc>
+        <w:tc>
+          <w:tcPr>
+            <w:tcW w:type="dxa" w:w="3360"/>
+          </w:tcPr>
+          <w:p>
+            <w:r>
+              <w:rPr>
+                <w:rFonts w:ascii="72" w:hAnsi="72" w:cs="72" w:eastAsia="72"/>
+                <w:b w:val="0"/>
+                <w:sz w:val="18"/>
+              </w:rPr>
+              <w:t xml:space="preserve">Gravada primeiro, só com a solicitação </w:t>
+            </w:r>
+            <w:r>
+              <w:rPr>
+                <w:rFonts w:ascii="Consolas" w:hAnsi="Consolas" w:cs="Consolas" w:eastAsia="Consolas"/>
+                <w:b w:val="0"/>
+                <w:sz w:val="16"/>
+              </w:rPr>
+              <w:t xml:space="preserve">PENDENTE</w:t>
+            </w:r>
+            <w:r>
+              <w:rPr>
+                <w:rFonts w:ascii="72" w:hAnsi="72" w:cs="72" w:eastAsia="72"/>
+                <w:b w:val="0"/>
+                <w:sz w:val="18"/>
+              </w:rPr>
+              <w:t xml:space="preserve"> (seção 10)</w:t>
+            </w:r>
+          </w:p>
+        </w:tc>
+      </w:tr>
+      <w:tr>
+        <w:tc>
+          <w:tcPr>
+            <w:tcW w:type="dxa" w:w="3360"/>
+          </w:tcPr>
+          <w:p>
+            <w:r>
+              <w:rPr>
+                <w:rFonts w:ascii="72" w:hAnsi="72" w:cs="72" w:eastAsia="72"/>
+                <w:b w:val="0"/>
+                <w:sz w:val="18"/>
+              </w:rPr>
+              <w:t xml:space="preserve">Pagar e aprovar</w:t>
+            </w:r>
+          </w:p>
+        </w:tc>
+        <w:tc>
+          <w:tcPr>
+            <w:tcW w:type="dxa" w:w="3360"/>
+          </w:tcPr>
+          <w:p>
+            <w:r>
+              <w:rPr>
+                <w:rFonts w:ascii="72" w:hAnsi="72" w:cs="72" w:eastAsia="72"/>
+                <w:b w:val="0"/>
+                <w:sz w:val="18"/>
+              </w:rPr>
+              <w:t xml:space="preserve">Regras no handler do serviço</w:t>
+            </w:r>
+          </w:p>
+        </w:tc>
+        <w:tc>
+          <w:tcPr>
+            <w:tcW w:type="dxa" w:w="3360"/>
+          </w:tcPr>
+          <w:p>
+            <w:r>
+              <w:rPr>
+                <w:rFonts w:ascii="72" w:hAnsi="72" w:cs="72" w:eastAsia="72"/>
+                <w:b w:val="0"/>
+                <w:sz w:val="18"/>
+              </w:rPr>
+              <w:t xml:space="preserve">Em </w:t>
+            </w:r>
+            <w:r>
+              <w:rPr>
+                <w:rFonts w:ascii="Consolas" w:hAnsi="Consolas" w:cs="Consolas" w:eastAsia="Consolas"/>
+                <w:b w:val="0"/>
+                <w:sz w:val="16"/>
+              </w:rPr>
+              <w:t xml:space="preserve">srv/lib/pedidos</w:t>
+            </w:r>
+            <w:r>
+              <w:rPr>
+                <w:rFonts w:ascii="72" w:hAnsi="72" w:cs="72" w:eastAsia="72"/>
+                <w:b w:val="0"/>
+                <w:sz w:val="18"/>
+              </w:rPr>
+              <w:t xml:space="preserve"> (</w:t>
+            </w:r>
+            <w:r>
+              <w:rPr>
+                <w:rFonts w:ascii="Consolas" w:hAnsi="Consolas" w:cs="Consolas" w:eastAsia="Consolas"/>
+                <w:b w:val="0"/>
+                <w:sz w:val="16"/>
+              </w:rPr>
+              <w:t xml:space="preserve">efetuarPagamento</w:t>
+            </w:r>
+            <w:r>
+              <w:rPr>
+                <w:rFonts w:ascii="72" w:hAnsi="72" w:cs="72" w:eastAsia="72"/>
+                <w:b w:val="0"/>
+                <w:sz w:val="18"/>
+              </w:rPr>
+              <w:t xml:space="preserve">, </w:t>
+            </w:r>
+            <w:r>
+              <w:rPr>
+                <w:rFonts w:ascii="Consolas" w:hAnsi="Consolas" w:cs="Consolas" w:eastAsia="Consolas"/>
+                <w:b w:val="0"/>
+                <w:sz w:val="16"/>
+              </w:rPr>
+              <w:t xml:space="preserve">finalizarPedido</w:t>
+            </w:r>
+            <w:r>
+              <w:rPr>
+                <w:rFonts w:ascii="72" w:hAnsi="72" w:cs="72" w:eastAsia="72"/>
+                <w:b w:val="0"/>
+                <w:sz w:val="18"/>
+              </w:rPr>
+              <w:t xml:space="preserve">), como o cancelamento (seção 7.2)</w:t>
+            </w:r>
+          </w:p>
+        </w:tc>
+      </w:tr>
+      <w:tr>
+        <w:tc>
+          <w:tcPr>
+            <w:tcW w:type="dxa" w:w="3360"/>
+          </w:tcPr>
+          <w:p>
+            <w:r>
+              <w:rPr>
+                <w:rFonts w:ascii="72" w:hAnsi="72" w:cs="72" w:eastAsia="72"/>
+                <w:b w:val="0"/>
+                <w:sz w:val="18"/>
+              </w:rPr>
+              <w:t xml:space="preserve">Depuração</w:t>
+            </w:r>
+          </w:p>
+        </w:tc>
+        <w:tc>
+          <w:tcPr>
+            <w:tcW w:type="dxa" w:w="3360"/>
+          </w:tcPr>
+          <w:p>
+            <w:r>
+              <w:rPr>
+                <w:rFonts w:ascii="Consolas" w:hAnsi="Consolas" w:cs="Consolas" w:eastAsia="Consolas"/>
+                <w:b w:val="0"/>
+                <w:sz w:val="16"/>
+              </w:rPr>
+              <w:t xml:space="preserve">launch.json</w:t>
+            </w:r>
+            <w:r>
+              <w:rPr>
+                <w:rFonts w:ascii="72" w:hAnsi="72" w:cs="72" w:eastAsia="72"/>
+                <w:b w:val="0"/>
+                <w:sz w:val="18"/>
+              </w:rPr>
+              <w:t xml:space="preserve"> dependia do </w:t>
+            </w:r>
+            <w:r>
+              <w:rPr>
+                <w:rFonts w:ascii="Consolas" w:hAnsi="Consolas" w:cs="Consolas" w:eastAsia="Consolas"/>
+                <w:b w:val="0"/>
+                <w:sz w:val="16"/>
+              </w:rPr>
+              <w:t xml:space="preserve">cds</w:t>
+            </w:r>
+            <w:r>
+              <w:rPr>
+                <w:rFonts w:ascii="72" w:hAnsi="72" w:cs="72" w:eastAsia="72"/>
+                <w:b w:val="0"/>
+                <w:sz w:val="18"/>
+              </w:rPr>
+              <w:t xml:space="preserve"> global e, no TypeScript, não carregava os </w:t>
+            </w:r>
+            <w:r>
+              <w:rPr>
+                <w:rFonts w:ascii="Consolas" w:hAnsi="Consolas" w:cs="Consolas" w:eastAsia="Consolas"/>
+                <w:b w:val="0"/>
+                <w:sz w:val="16"/>
+              </w:rPr>
+              <w:t xml:space="preserve">.ts</w:t>
+            </w:r>
+          </w:p>
+        </w:tc>
+        <w:tc>
+          <w:tcPr>
+            <w:tcW w:type="dxa" w:w="3360"/>
+          </w:tcPr>
+          <w:p>
+            <w:r>
+              <w:rPr>
+                <w:rFonts w:ascii="72" w:hAnsi="72" w:cs="72" w:eastAsia="72"/>
+                <w:b w:val="0"/>
+                <w:sz w:val="18"/>
+              </w:rPr>
+              <w:t xml:space="preserve">Configurações de servidor e testes nas duas implementações (seção 19.1)</w:t>
+            </w:r>
+          </w:p>
+        </w:tc>
+      </w:tr>
+      <w:tr>
+        <w:tc>
+          <w:tcPr>
+            <w:tcW w:type="dxa" w:w="3360"/>
+          </w:tcPr>
+          <w:p>
+            <w:r>
+              <w:rPr>
+                <w:rFonts w:ascii="72" w:hAnsi="72" w:cs="72" w:eastAsia="72"/>
+                <w:b w:val="0"/>
+                <w:sz w:val="18"/>
+              </w:rPr>
+              <w:t xml:space="preserve">Testes</w:t>
+            </w:r>
+          </w:p>
+        </w:tc>
+        <w:tc>
+          <w:tcPr>
+            <w:tcW w:type="dxa" w:w="3360"/>
+          </w:tcPr>
+          <w:p>
+            <w:r>
+              <w:rPr>
+                <w:rFonts w:ascii="72" w:hAnsi="72" w:cs="72" w:eastAsia="72"/>
+                <w:b w:val="0"/>
+                <w:sz w:val="18"/>
+              </w:rPr>
+              <w:t xml:space="preserve">71 (JavaScript) e 73 (TypeScript)</w:t>
+            </w:r>
+          </w:p>
+        </w:tc>
+        <w:tc>
+          <w:tcPr>
+            <w:tcW w:type="dxa" w:w="3360"/>
+          </w:tcPr>
+          <w:p>
+            <w:r>
+              <w:rPr>
+                <w:rFonts w:ascii="72" w:hAnsi="72" w:cs="72" w:eastAsia="72"/>
+                <w:b w:val="0"/>
+                <w:sz w:val="18"/>
+              </w:rPr>
+              <w:t xml:space="preserve">72 (JavaScript) e 74 (TypeScript)</w:t>
             </w:r>
           </w:p>
         </w:tc>

</xml_diff>

<commit_message>
chore: .vscode igual ao gerado pelo cds init (padrão do BAS)
As duas implementações voltam ao .vscode do template nodejs do cds init,
o mesmo que o SAP Business Application Studio cria num projeto CAP:
configuração de depuração "cds serve" (cds serve --with-mocks
--in-memory?), tarefa "cds watch" e extensões recomendadas. Na versão
TypeScript o cds serve também carrega os handlers .ts.

README (v1.7) e especificação técnica 2.4 (.md e .docx) descrevem essa
configuração no lugar das configurações de depuração próprias.

Co-Authored-By: Claude Opus 5.5 <noreply@anthropic.com>
</commit_message>
<xml_diff>
--- a/docs/especificacao-tecnica.docx
+++ b/docs/especificacao-tecnica.docx
@@ -68,7 +68,7 @@
           <w:b w:val="0"/>
           <w:sz w:val="20"/>
         </w:rPr>
-        <w:t xml:space="preserve"> (TypeScript). As duas compartilham o mesmo modelo CDS, os mesmos serviços, as mesmas aplicações SAPUI5 e a mesma suíte de testes; diferem apenas na linguagem dos handlers (seção 19). A seção 22 resume o que mudou em relação à versão 1 e nas revisões 2.1 (campos somente leitura no pedido, navegação entre apps e importação de pedidos sem duplicidade), 2.2 (análises em quatro apps, máscara no pagamento e navegações das Object Pages), 2.3 (permissões na UI, ações recusadas no rascunho e proteções na importação) e 2.4 (transições de status atômicas nas ações do pedido e depuração no VS Code).</w:t>
+        <w:t xml:space="preserve"> (TypeScript). As duas compartilham o mesmo modelo CDS, os mesmos serviços, as mesmas aplicações SAPUI5 e a mesma suíte de testes; diferem apenas na linguagem dos handlers (seção 19). A seção 22 resume o que mudou em relação à versão 1 e nas revisões 2.1 (campos somente leitura no pedido, navegação entre apps e importação de pedidos sem duplicidade), 2.2 (análises em quatro apps, máscara no pagamento e navegações das Object Pages), 2.3 (permissões na UI, ações recusadas no rascunho e proteções na importação) e 2.4 (transições de status atômicas nas ações do pedido).</w:t>
       </w:r>
     </w:p>
     <w:p>
@@ -29168,7 +29168,7 @@
                 <w:b w:val="0"/>
                 <w:sz w:val="18"/>
               </w:rPr>
-              <w:t xml:space="preserve">Depurar (VS Code)</w:t>
+              <w:t xml:space="preserve">Depurar (VS Code / BAS)</w:t>
             </w:r>
           </w:p>
         </w:tc>
@@ -29179,41 +29179,18 @@
           <w:p>
             <w:r>
               <w:rPr>
-                <w:rFonts w:ascii="Consolas" w:hAnsi="Consolas" w:cs="Consolas" w:eastAsia="Consolas"/>
-                <w:b w:val="0"/>
-                <w:sz w:val="16"/>
-              </w:rPr>
-              <w:t xml:space="preserve">.vscode/launch.json</w:t>
-            </w:r>
-            <w:r>
-              <w:rPr>
-                <w:rFonts w:ascii="72" w:hAnsi="72" w:cs="72" w:eastAsia="72"/>
-                <w:b w:val="0"/>
-                <w:sz w:val="18"/>
-              </w:rPr>
-              <w:t xml:space="preserve">: servidor (</w:t>
-            </w:r>
-            <w:r>
-              <w:rPr>
-                <w:rFonts w:ascii="Consolas" w:hAnsi="Consolas" w:cs="Consolas" w:eastAsia="Consolas"/>
-                <w:b w:val="0"/>
-                <w:sz w:val="16"/>
-              </w:rPr>
-              <w:t xml:space="preserve">cds watch</w:t>
-            </w:r>
-            <w:r>
-              <w:rPr>
-                <w:rFonts w:ascii="72" w:hAnsi="72" w:cs="72" w:eastAsia="72"/>
-                <w:b w:val="0"/>
-                <w:sz w:val="18"/>
-              </w:rPr>
-              <w:t xml:space="preserve"> ou </w:t>
-            </w:r>
-            <w:r>
-              <w:rPr>
-                <w:rFonts w:ascii="Consolas" w:hAnsi="Consolas" w:cs="Consolas" w:eastAsia="Consolas"/>
-                <w:b w:val="0"/>
-                <w:sz w:val="16"/>
+                <w:rFonts w:ascii="72" w:hAnsi="72" w:cs="72" w:eastAsia="72"/>
+                <w:b w:val="0"/>
+                <w:sz w:val="18"/>
+              </w:rPr>
+              <w:t xml:space="preserve">Configuração </w:t>
+            </w:r>
+            <w:r>
+              <w:rPr>
+                <w:rFonts w:ascii="72" w:hAnsi="72" w:cs="72" w:eastAsia="72"/>
+                <w:b w:val="0"/>
+                <w:sz w:val="18"/>
+                <w:i/>
               </w:rPr>
               <w:t xml:space="preserve">cds serve</w:t>
             </w:r>
@@ -29223,7 +29200,23 @@
                 <w:b w:val="0"/>
                 <w:sz w:val="18"/>
               </w:rPr>
-              <w:t xml:space="preserve">), todos os testes, teste do arquivo aberto, anexar a processo</w:t>
+              <w:t xml:space="preserve"> (</w:t>
+            </w:r>
+            <w:r>
+              <w:rPr>
+                <w:rFonts w:ascii="Consolas" w:hAnsi="Consolas" w:cs="Consolas" w:eastAsia="Consolas"/>
+                <w:b w:val="0"/>
+                <w:sz w:val="16"/>
+              </w:rPr>
+              <w:t xml:space="preserve">cds serve --with-mocks --in-memory?</w:t>
+            </w:r>
+            <w:r>
+              <w:rPr>
+                <w:rFonts w:ascii="72" w:hAnsi="72" w:cs="72" w:eastAsia="72"/>
+                <w:b w:val="0"/>
+                <w:sz w:val="18"/>
+              </w:rPr>
+              <w:t xml:space="preserve">)</w:t>
             </w:r>
           </w:p>
         </w:tc>
@@ -29238,39 +29231,23 @@
                 <w:b w:val="0"/>
                 <w:sz w:val="18"/>
               </w:rPr>
-              <w:t xml:space="preserve">Idem com </w:t>
-            </w:r>
-            <w:r>
-              <w:rPr>
-                <w:rFonts w:ascii="Consolas" w:hAnsi="Consolas" w:cs="Consolas" w:eastAsia="Consolas"/>
-                <w:b w:val="0"/>
-                <w:sz w:val="16"/>
-              </w:rPr>
-              <w:t xml:space="preserve">cds-tsx</w:t>
-            </w:r>
-            <w:r>
-              <w:rPr>
-                <w:rFonts w:ascii="72" w:hAnsi="72" w:cs="72" w:eastAsia="72"/>
-                <w:b w:val="0"/>
-                <w:sz w:val="18"/>
-              </w:rPr>
-              <w:t xml:space="preserve"> e </w:t>
-            </w:r>
-            <w:r>
-              <w:rPr>
-                <w:rFonts w:ascii="Consolas" w:hAnsi="Consolas" w:cs="Consolas" w:eastAsia="Consolas"/>
-                <w:b w:val="0"/>
-                <w:sz w:val="16"/>
-              </w:rPr>
-              <w:t xml:space="preserve">tsx</w:t>
-            </w:r>
-            <w:r>
-              <w:rPr>
-                <w:rFonts w:ascii="72" w:hAnsi="72" w:cs="72" w:eastAsia="72"/>
-                <w:b w:val="0"/>
-                <w:sz w:val="18"/>
-              </w:rPr>
-              <w:t xml:space="preserve"> (breakpoints direto nos </w:t>
+              <w:t xml:space="preserve">Idem (o </w:t>
+            </w:r>
+            <w:r>
+              <w:rPr>
+                <w:rFonts w:ascii="Consolas" w:hAnsi="Consolas" w:cs="Consolas" w:eastAsia="Consolas"/>
+                <w:b w:val="0"/>
+                <w:sz w:val="16"/>
+              </w:rPr>
+              <w:t xml:space="preserve">cds serve</w:t>
+            </w:r>
+            <w:r>
+              <w:rPr>
+                <w:rFonts w:ascii="72" w:hAnsi="72" w:cs="72" w:eastAsia="72"/>
+                <w:b w:val="0"/>
+                <w:sz w:val="18"/>
+              </w:rPr>
+              <w:t xml:space="preserve"> carrega os handlers </w:t>
             </w:r>
             <w:r>
               <w:rPr>
@@ -29286,7 +29263,7 @@
                 <w:b w:val="0"/>
                 <w:sz w:val="18"/>
               </w:rPr>
-              <w:t xml:space="preserve">, com source maps)</w:t>
+              <w:t xml:space="preserve">)</w:t>
             </w:r>
           </w:p>
         </w:tc>
@@ -29301,7 +29278,7 @@
           <w:b w:val="0"/>
           <w:sz w:val="20"/>
         </w:rPr>
-        <w:t xml:space="preserve">Para depurar, abra a pasta da implementação (</w:t>
+        <w:t xml:space="preserve">O </w:t>
       </w:r>
       <w:r>
         <w:rPr>
@@ -29309,15 +29286,15 @@
           <w:b w:val="0"/>
           <w:sz w:val="18"/>
         </w:rPr>
-        <w:t xml:space="preserve">nodejs-padrao</w:t>
-      </w:r>
-      <w:r>
-        <w:rPr>
-          <w:rFonts w:ascii="72" w:hAnsi="72" w:cs="72" w:eastAsia="72"/>
-          <w:b w:val="0"/>
-          <w:sz w:val="20"/>
-        </w:rPr>
-        <w:t xml:space="preserve"> ou </w:t>
+        <w:t xml:space="preserve">.vscode</w:t>
+      </w:r>
+      <w:r>
+        <w:rPr>
+          <w:rFonts w:ascii="72" w:hAnsi="72" w:cs="72" w:eastAsia="72"/>
+          <w:b w:val="0"/>
+          <w:sz w:val="20"/>
+        </w:rPr>
+        <w:t xml:space="preserve"> de cada implementação é o gerado pelo </w:t>
       </w:r>
       <w:r>
         <w:rPr>
@@ -29325,15 +29302,32 @@
           <w:b w:val="0"/>
           <w:sz w:val="18"/>
         </w:rPr>
-        <w:t xml:space="preserve">nodejs-typescript</w:t>
-      </w:r>
-      <w:r>
-        <w:rPr>
-          <w:rFonts w:ascii="72" w:hAnsi="72" w:cs="72" w:eastAsia="72"/>
-          <w:b w:val="0"/>
-          <w:sz w:val="20"/>
-        </w:rPr>
-        <w:t xml:space="preserve">) como workspace no VS Code e rode </w:t>
+        <w:t xml:space="preserve">cds init</w:t>
+      </w:r>
+      <w:r>
+        <w:rPr>
+          <w:rFonts w:ascii="72" w:hAnsi="72" w:cs="72" w:eastAsia="72"/>
+          <w:b w:val="0"/>
+          <w:sz w:val="20"/>
+        </w:rPr>
+        <w:t xml:space="preserve">, o mesmo que o SAP Business Application Studio cria num projeto CAP: a configuração de depuração </w:t>
+      </w:r>
+      <w:r>
+        <w:rPr>
+          <w:rFonts w:ascii="72" w:hAnsi="72" w:cs="72" w:eastAsia="72"/>
+          <w:b w:val="0"/>
+          <w:sz w:val="20"/>
+          <w:i/>
+        </w:rPr>
+        <w:t xml:space="preserve">cds serve</w:t>
+      </w:r>
+      <w:r>
+        <w:rPr>
+          <w:rFonts w:ascii="72" w:hAnsi="72" w:cs="72" w:eastAsia="72"/>
+          <w:b w:val="0"/>
+          <w:sz w:val="20"/>
+        </w:rPr>
+        <w:t xml:space="preserve"> (</w:t>
       </w:r>
       <w:r>
         <w:rPr>
@@ -29341,15 +29335,32 @@
           <w:b w:val="0"/>
           <w:sz w:val="18"/>
         </w:rPr>
-        <w:t xml:space="preserve">npm install</w:t>
-      </w:r>
-      <w:r>
-        <w:rPr>
-          <w:rFonts w:ascii="72" w:hAnsi="72" w:cs="72" w:eastAsia="72"/>
-          <w:b w:val="0"/>
-          <w:sz w:val="20"/>
-        </w:rPr>
-        <w:t xml:space="preserve">. As configurações usam os executáveis locais de </w:t>
+        <w:t xml:space="preserve">launch.json</w:t>
+      </w:r>
+      <w:r>
+        <w:rPr>
+          <w:rFonts w:ascii="72" w:hAnsi="72" w:cs="72" w:eastAsia="72"/>
+          <w:b w:val="0"/>
+          <w:sz w:val="20"/>
+        </w:rPr>
+        <w:t xml:space="preserve">), a tarefa </w:t>
+      </w:r>
+      <w:r>
+        <w:rPr>
+          <w:rFonts w:ascii="72" w:hAnsi="72" w:cs="72" w:eastAsia="72"/>
+          <w:b w:val="0"/>
+          <w:sz w:val="20"/>
+          <w:i/>
+        </w:rPr>
+        <w:t xml:space="preserve">cds watch</w:t>
+      </w:r>
+      <w:r>
+        <w:rPr>
+          <w:rFonts w:ascii="72" w:hAnsi="72" w:cs="72" w:eastAsia="72"/>
+          <w:b w:val="0"/>
+          <w:sz w:val="20"/>
+        </w:rPr>
+        <w:t xml:space="preserve"> (</w:t>
       </w:r>
       <w:r>
         <w:rPr>
@@ -29357,15 +29368,15 @@
           <w:b w:val="0"/>
           <w:sz w:val="18"/>
         </w:rPr>
-        <w:t xml:space="preserve">node_modules/.bin</w:t>
-      </w:r>
-      <w:r>
-        <w:rPr>
-          <w:rFonts w:ascii="72" w:hAnsi="72" w:cs="72" w:eastAsia="72"/>
-          <w:b w:val="0"/>
-          <w:sz w:val="20"/>
-        </w:rPr>
-        <w:t xml:space="preserve"> e anexam automaticamente os processos filhos do </w:t>
+        <w:t xml:space="preserve">tasks.json</w:t>
+      </w:r>
+      <w:r>
+        <w:rPr>
+          <w:rFonts w:ascii="72" w:hAnsi="72" w:cs="72" w:eastAsia="72"/>
+          <w:b w:val="0"/>
+          <w:sz w:val="20"/>
+        </w:rPr>
+        <w:t xml:space="preserve">) e as extensões recomendadas. Elas usam o </w:t>
       </w:r>
       <w:r>
         <w:rPr>
@@ -29373,15 +29384,15 @@
           <w:b w:val="0"/>
           <w:sz w:val="18"/>
         </w:rPr>
-        <w:t xml:space="preserve">watch</w:t>
-      </w:r>
-      <w:r>
-        <w:rPr>
-          <w:rFonts w:ascii="72" w:hAnsi="72" w:cs="72" w:eastAsia="72"/>
-          <w:b w:val="0"/>
-          <w:sz w:val="20"/>
-        </w:rPr>
-        <w:t xml:space="preserve"> e do </w:t>
+        <w:t xml:space="preserve">cds</w:t>
+      </w:r>
+      <w:r>
+        <w:rPr>
+          <w:rFonts w:ascii="72" w:hAnsi="72" w:cs="72" w:eastAsia="72"/>
+          <w:b w:val="0"/>
+          <w:sz w:val="20"/>
+        </w:rPr>
+        <w:t xml:space="preserve"> global (</w:t>
       </w:r>
       <w:r>
         <w:rPr>
@@ -29389,15 +29400,15 @@
           <w:b w:val="0"/>
           <w:sz w:val="18"/>
         </w:rPr>
-        <w:t xml:space="preserve">node --test</w:t>
-      </w:r>
-      <w:r>
-        <w:rPr>
-          <w:rFonts w:ascii="72" w:hAnsi="72" w:cs="72" w:eastAsia="72"/>
-          <w:b w:val="0"/>
-          <w:sz w:val="20"/>
-        </w:rPr>
-        <w:t xml:space="preserve">.</w:t>
+        <w:t xml:space="preserve">npm i -g @sap/cds-dk</w:t>
+      </w:r>
+      <w:r>
+        <w:rPr>
+          <w:rFonts w:ascii="72" w:hAnsi="72" w:cs="72" w:eastAsia="72"/>
+          <w:b w:val="0"/>
+          <w:sz w:val="20"/>
+        </w:rPr>
+        <w:t xml:space="preserve">); abra a pasta da implementação como workspace para depurar.</w:t>
       </w:r>
     </w:p>
     <w:p>
@@ -33222,85 +33233,6 @@
                 <w:sz w:val="18"/>
               </w:rPr>
               <w:t xml:space="preserve">), como o cancelamento (seção 7.2)</w:t>
-            </w:r>
-          </w:p>
-        </w:tc>
-      </w:tr>
-      <w:tr>
-        <w:tc>
-          <w:tcPr>
-            <w:tcW w:type="dxa" w:w="3360"/>
-          </w:tcPr>
-          <w:p>
-            <w:r>
-              <w:rPr>
-                <w:rFonts w:ascii="72" w:hAnsi="72" w:cs="72" w:eastAsia="72"/>
-                <w:b w:val="0"/>
-                <w:sz w:val="18"/>
-              </w:rPr>
-              <w:t xml:space="preserve">Depuração</w:t>
-            </w:r>
-          </w:p>
-        </w:tc>
-        <w:tc>
-          <w:tcPr>
-            <w:tcW w:type="dxa" w:w="3360"/>
-          </w:tcPr>
-          <w:p>
-            <w:r>
-              <w:rPr>
-                <w:rFonts w:ascii="Consolas" w:hAnsi="Consolas" w:cs="Consolas" w:eastAsia="Consolas"/>
-                <w:b w:val="0"/>
-                <w:sz w:val="16"/>
-              </w:rPr>
-              <w:t xml:space="preserve">launch.json</w:t>
-            </w:r>
-            <w:r>
-              <w:rPr>
-                <w:rFonts w:ascii="72" w:hAnsi="72" w:cs="72" w:eastAsia="72"/>
-                <w:b w:val="0"/>
-                <w:sz w:val="18"/>
-              </w:rPr>
-              <w:t xml:space="preserve"> dependia do </w:t>
-            </w:r>
-            <w:r>
-              <w:rPr>
-                <w:rFonts w:ascii="Consolas" w:hAnsi="Consolas" w:cs="Consolas" w:eastAsia="Consolas"/>
-                <w:b w:val="0"/>
-                <w:sz w:val="16"/>
-              </w:rPr>
-              <w:t xml:space="preserve">cds</w:t>
-            </w:r>
-            <w:r>
-              <w:rPr>
-                <w:rFonts w:ascii="72" w:hAnsi="72" w:cs="72" w:eastAsia="72"/>
-                <w:b w:val="0"/>
-                <w:sz w:val="18"/>
-              </w:rPr>
-              <w:t xml:space="preserve"> global e, no TypeScript, não carregava os </w:t>
-            </w:r>
-            <w:r>
-              <w:rPr>
-                <w:rFonts w:ascii="Consolas" w:hAnsi="Consolas" w:cs="Consolas" w:eastAsia="Consolas"/>
-                <w:b w:val="0"/>
-                <w:sz w:val="16"/>
-              </w:rPr>
-              <w:t xml:space="preserve">.ts</w:t>
-            </w:r>
-          </w:p>
-        </w:tc>
-        <w:tc>
-          <w:tcPr>
-            <w:tcW w:type="dxa" w:w="3360"/>
-          </w:tcPr>
-          <w:p>
-            <w:r>
-              <w:rPr>
-                <w:rFonts w:ascii="72" w:hAnsi="72" w:cs="72" w:eastAsia="72"/>
-                <w:b w:val="0"/>
-                <w:sz w:val="18"/>
-              </w:rPr>
-              <w:t xml:space="preserve">Configurações de servidor e testes nas duas implementações (seção 19.1)</w:t>
             </w:r>
           </w:p>
         </w:tc>

</xml_diff>